<commit_message>
ProjectBase-Part_1, Apostila atualizada do banco de dados,
ProjectBase-Part_1
</commit_message>
<xml_diff>
--- a/Apostilas/Basica II/Apostila Básica II de CSharp - Cap 6.1 - Migrations (Gerando o Banco de Dados Automaticamente).docx
+++ b/Apostilas/Basica II/Apostila Básica II de CSharp - Cap 6.1 - Migrations (Gerando o Banco de Dados Automaticamente).docx
@@ -465,7 +465,21 @@
         <w:rPr>
           <w:lang w:val="pt-BR"/>
         </w:rPr>
-        <w:t xml:space="preserve">O sistema vai pensar um pouco e criar uma nova pasta no seu projeto chamada </w:t>
+        <w:t xml:space="preserve">O sistema vai pensar um pouco e </w:t>
+      </w:r>
+      <w:proofErr w:type="gramStart"/>
+      <w:r>
+        <w:rPr>
+          <w:lang w:val="pt-BR"/>
+        </w:rPr>
+        <w:t>criar uma nova</w:t>
+      </w:r>
+      <w:proofErr w:type="gramEnd"/>
+      <w:r>
+        <w:rPr>
+          <w:lang w:val="pt-BR"/>
+        </w:rPr>
+        <w:t xml:space="preserve"> pasta no seu projeto chamada </w:t>
       </w:r>
       <w:proofErr w:type="spellStart"/>
       <w:r>
@@ -655,6 +669,7 @@
         <w:t xml:space="preserve">O C# vai se conectar ao MySQL (usando aquela senha que colocamos no </w:t>
       </w:r>
       <w:proofErr w:type="spellStart"/>
+      <w:proofErr w:type="gramStart"/>
       <w:r>
         <w:rPr>
           <w:lang w:val="pt-BR"/>
@@ -662,11 +677,26 @@
         <w:t>appsettings.json</w:t>
       </w:r>
       <w:proofErr w:type="spellEnd"/>
+      <w:proofErr w:type="gramEnd"/>
       <w:r>
         <w:rPr>
           <w:lang w:val="pt-BR"/>
         </w:rPr>
-        <w:t xml:space="preserve">), criar o banco </w:t>
+        <w:t xml:space="preserve">), criar o </w:t>
+      </w:r>
+      <w:proofErr w:type="gramStart"/>
+      <w:r>
+        <w:rPr>
+          <w:lang w:val="pt-BR"/>
+        </w:rPr>
+        <w:t>banco</w:t>
+      </w:r>
+      <w:proofErr w:type="gramEnd"/>
+      <w:r>
+        <w:rPr>
+          <w:lang w:val="pt-BR"/>
+        </w:rPr>
+        <w:t xml:space="preserve"> </w:t>
       </w:r>
       <w:proofErr w:type="spellStart"/>
       <w:r>
@@ -1050,6 +1080,7 @@
         </w:rPr>
       </w:pPr>
       <w:proofErr w:type="spellStart"/>
+      <w:proofErr w:type="gramStart"/>
       <w:r>
         <w:rPr>
           <w:lang w:val="pt-BR"/>
@@ -1057,6 +1088,7 @@
         <w:t>HttpContext.Session.SetString</w:t>
       </w:r>
       <w:proofErr w:type="spellEnd"/>
+      <w:proofErr w:type="gramEnd"/>
       <w:r>
         <w:rPr>
           <w:lang w:val="pt-BR"/>
@@ -1078,6 +1110,7 @@
         <w:t xml:space="preserve">", </w:t>
       </w:r>
       <w:proofErr w:type="spellStart"/>
+      <w:proofErr w:type="gramStart"/>
       <w:r>
         <w:rPr>
           <w:lang w:val="pt-BR"/>
@@ -1085,6 +1118,7 @@
         <w:t>usuario.Nome</w:t>
       </w:r>
       <w:proofErr w:type="spellEnd"/>
+      <w:proofErr w:type="gramEnd"/>
       <w:r>
         <w:rPr>
           <w:lang w:val="pt-BR"/>
@@ -1296,7 +1330,29 @@
           <w:szCs w:val="21"/>
           <w:lang w:val="pt-BR" w:eastAsia="pt-BR"/>
         </w:rPr>
-        <w:t xml:space="preserve"> = HttpContextAccessor.HttpContext.Session.GetString("UsuarioLogado");</w:t>
+        <w:t xml:space="preserve"> = </w:t>
+      </w:r>
+      <w:proofErr w:type="gramStart"/>
+      <w:r>
+        <w:rPr>
+          <w:rFonts w:ascii="Consolas" w:eastAsia="Times New Roman" w:hAnsi="Consolas" w:cs="Consolas"/>
+          <w:color w:val="BBBEBF"/>
+          <w:sz w:val="21"/>
+          <w:szCs w:val="21"/>
+          <w:lang w:val="pt-BR" w:eastAsia="pt-BR"/>
+        </w:rPr>
+        <w:t>HttpContextAccessor.HttpContext.Session.GetString</w:t>
+      </w:r>
+      <w:proofErr w:type="gramEnd"/>
+      <w:r>
+        <w:rPr>
+          <w:rFonts w:ascii="Consolas" w:eastAsia="Times New Roman" w:hAnsi="Consolas" w:cs="Consolas"/>
+          <w:color w:val="BBBEBF"/>
+          <w:sz w:val="21"/>
+          <w:szCs w:val="21"/>
+          <w:lang w:val="pt-BR" w:eastAsia="pt-BR"/>
+        </w:rPr>
+        <w:t>("UsuarioLogado");</w:t>
       </w:r>
     </w:p>
     <w:p>
@@ -1355,7 +1411,29 @@
           <w:szCs w:val="21"/>
           <w:lang w:val="pt-BR" w:eastAsia="pt-BR"/>
         </w:rPr>
-        <w:t xml:space="preserve">@if(nomeUsuario != </w:t>
+        <w:t>@</w:t>
+      </w:r>
+      <w:proofErr w:type="gramStart"/>
+      <w:r>
+        <w:rPr>
+          <w:rFonts w:ascii="Consolas" w:eastAsia="Times New Roman" w:hAnsi="Consolas" w:cs="Consolas"/>
+          <w:color w:val="BBBEBF"/>
+          <w:sz w:val="21"/>
+          <w:szCs w:val="21"/>
+          <w:lang w:val="pt-BR" w:eastAsia="pt-BR"/>
+        </w:rPr>
+        <w:t>if(nomeUsuario !</w:t>
+      </w:r>
+      <w:proofErr w:type="gramEnd"/>
+      <w:r>
+        <w:rPr>
+          <w:rFonts w:ascii="Consolas" w:eastAsia="Times New Roman" w:hAnsi="Consolas" w:cs="Consolas"/>
+          <w:color w:val="BBBEBF"/>
+          <w:sz w:val="21"/>
+          <w:szCs w:val="21"/>
+          <w:lang w:val="pt-BR" w:eastAsia="pt-BR"/>
+        </w:rPr>
+        <w:t xml:space="preserve">= </w:t>
       </w:r>
       <w:proofErr w:type="spellStart"/>
       <w:r>
@@ -1556,7 +1634,18 @@
           <w:szCs w:val="21"/>
           <w:lang w:val="pt-BR" w:eastAsia="pt-BR"/>
         </w:rPr>
-        <w:t>Olá, @nomeUsuario! Você está logado no sistema da Etec.</w:t>
+        <w:t xml:space="preserve">Olá, @nomeUsuario! Você está logado no sistema da </w:t>
+      </w:r>
+      <w:proofErr w:type="gramStart"/>
+      <w:r>
+        <w:rPr>
+          <w:rFonts w:ascii="Consolas" w:eastAsia="Times New Roman" w:hAnsi="Consolas" w:cs="Consolas"/>
+          <w:color w:val="BBBEBF"/>
+          <w:sz w:val="21"/>
+          <w:szCs w:val="21"/>
+          <w:lang w:val="pt-BR" w:eastAsia="pt-BR"/>
+        </w:rPr>
+        <w:t>Etec.</w:t>
       </w:r>
       <w:r>
         <w:rPr>
@@ -1566,7 +1655,18 @@
           <w:szCs w:val="21"/>
           <w:lang w:val="pt-BR" w:eastAsia="pt-BR"/>
         </w:rPr>
-        <w:t>&lt;/</w:t>
+        <w:t>&lt;</w:t>
+      </w:r>
+      <w:proofErr w:type="gramEnd"/>
+      <w:r>
+        <w:rPr>
+          <w:rFonts w:ascii="Consolas" w:eastAsia="Times New Roman" w:hAnsi="Consolas" w:cs="Consolas"/>
+          <w:color w:val="808080"/>
+          <w:sz w:val="21"/>
+          <w:szCs w:val="21"/>
+          <w:lang w:val="pt-BR" w:eastAsia="pt-BR"/>
+        </w:rPr>
+        <w:t>/</w:t>
       </w:r>
       <w:r>
         <w:rPr>
@@ -1988,7 +2088,18 @@
           <w:szCs w:val="21"/>
           <w:lang w:val="pt-BR" w:eastAsia="pt-BR"/>
         </w:rPr>
-        <w:t>Clique aqui para entrar.</w:t>
+        <w:t xml:space="preserve">Clique aqui para </w:t>
+      </w:r>
+      <w:proofErr w:type="gramStart"/>
+      <w:r>
+        <w:rPr>
+          <w:rFonts w:ascii="Consolas" w:eastAsia="Times New Roman" w:hAnsi="Consolas" w:cs="Consolas"/>
+          <w:color w:val="BBBEBF"/>
+          <w:sz w:val="21"/>
+          <w:szCs w:val="21"/>
+          <w:lang w:val="pt-BR" w:eastAsia="pt-BR"/>
+        </w:rPr>
+        <w:t>entrar.</w:t>
       </w:r>
       <w:r>
         <w:rPr>
@@ -1998,7 +2109,18 @@
           <w:szCs w:val="21"/>
           <w:lang w:val="pt-BR" w:eastAsia="pt-BR"/>
         </w:rPr>
-        <w:t>&lt;/</w:t>
+        <w:t>&lt;</w:t>
+      </w:r>
+      <w:proofErr w:type="gramEnd"/>
+      <w:r>
+        <w:rPr>
+          <w:rFonts w:ascii="Consolas" w:eastAsia="Times New Roman" w:hAnsi="Consolas" w:cs="Consolas"/>
+          <w:color w:val="808080"/>
+          <w:sz w:val="21"/>
+          <w:szCs w:val="21"/>
+          <w:lang w:val="pt-BR" w:eastAsia="pt-BR"/>
+        </w:rPr>
+        <w:t>/</w:t>
       </w:r>
       <w:r>
         <w:rPr>
@@ -2128,79 +2250,57 @@
     </w:p>
     <w:p>
       <w:pPr>
+        <w:pStyle w:val="Ttulo2"/>
         <w:rPr>
           <w:lang w:val="pt-BR"/>
         </w:rPr>
       </w:pPr>
+      <w:r>
+        <w:rPr>
+          <w:lang w:val="pt-BR" w:bidi="pt-BR"/>
+        </w:rPr>
+        <w:t xml:space="preserve">Passo </w:t>
+      </w:r>
+      <w:proofErr w:type="gramStart"/>
+      <w:r>
+        <w:rPr>
+          <w:lang w:val="pt-BR" w:bidi="pt-BR"/>
+        </w:rPr>
+        <w:t xml:space="preserve">Erro </w:t>
+      </w:r>
+      <w:r>
+        <w:rPr>
+          <w:lang w:val="pt-BR" w:bidi="pt-BR"/>
+        </w:rPr>
+        <w:t>:</w:t>
+      </w:r>
+      <w:proofErr w:type="gramEnd"/>
+      <w:r>
+        <w:rPr>
+          <w:lang w:val="pt-BR" w:bidi="pt-BR"/>
+        </w:rPr>
+        <w:t xml:space="preserve"> </w:t>
+      </w:r>
+      <w:r>
+        <w:rPr>
+          <w:lang w:val="pt-BR" w:bidi="pt-BR"/>
+        </w:rPr>
+        <w:t>Se a versão 10 não funcionar</w:t>
+      </w:r>
     </w:p>
     <w:p>
       <w:pPr>
         <w:rPr>
-          <w:lang w:val="pt-BR"/>
+          <w:lang w:val="en-US"/>
         </w:rPr>
       </w:pPr>
-    </w:p>
-    <w:p>
-      <w:pPr>
-        <w:rPr>
-          <w:lang w:val="pt-BR"/>
-        </w:rPr>
-      </w:pPr>
-    </w:p>
-    <w:p>
-      <w:pPr>
-        <w:rPr>
-          <w:lang w:val="pt-BR"/>
-        </w:rPr>
-      </w:pPr>
-    </w:p>
-    <w:p>
-      <w:pPr>
-        <w:rPr>
-          <w:lang w:val="pt-BR"/>
-        </w:rPr>
-      </w:pPr>
-    </w:p>
-    <w:p>
-      <w:pPr>
-        <w:rPr>
-          <w:lang w:val="pt-BR"/>
-        </w:rPr>
-      </w:pPr>
-    </w:p>
-    <w:p>
-      <w:pPr>
-        <w:rPr>
-          <w:lang w:val="pt-BR"/>
-        </w:rPr>
-      </w:pPr>
-    </w:p>
-    <w:p>
-      <w:pPr>
-        <w:rPr>
-          <w:lang w:val="pt-BR"/>
-        </w:rPr>
-      </w:pPr>
-      <w:r>
-        <w:rPr>
-          <w:rStyle w:val="nfase"/>
-          <w:lang w:val="pt-BR" w:bidi="pt-BR"/>
-        </w:rPr>
-        <w:t xml:space="preserve">Experimente: </w:t>
-      </w:r>
-      <w:r>
-        <w:rPr>
-          <w:lang w:val="pt-BR" w:bidi="pt-BR"/>
-        </w:rPr>
-        <w:t>Atualizar o estilo e, em seguida, atualizar o Sumário.</w:t>
-      </w:r>
     </w:p>
     <w:p>
       <w:pPr>
         <w:pStyle w:val="Numerada"/>
         <w:numPr>
           <w:ilvl w:val="0"/>
-          <w:numId w:val="32"/>
+          <w:numId w:val="38"/>
         </w:numPr>
         <w:rPr>
           <w:lang w:val="pt-BR"/>
@@ -2208,22 +2308,9 @@
       </w:pPr>
       <w:r>
         <w:rPr>
-          <w:lang w:val="pt-BR" w:bidi="pt-BR"/>
-        </w:rPr>
-        <w:t>Clique no título acima (</w:t>
-      </w:r>
-      <w:r>
-        <w:rPr>
-          <w:rStyle w:val="Caracteredenfasedecitao"/>
-          <w:lang w:val="pt-BR" w:bidi="pt-BR"/>
-        </w:rPr>
-        <w:t>Usar estilos de títulos</w:t>
-      </w:r>
-      <w:r>
-        <w:rPr>
-          <w:lang w:val="pt-BR" w:bidi="pt-BR"/>
-        </w:rPr>
-        <w:t>), certifique-se apenas de clicar, não selecione nada.</w:t>
+          <w:lang w:val="pt-BR"/>
+        </w:rPr>
+        <w:t>Digite o comando</w:t>
       </w:r>
     </w:p>
     <w:p>
@@ -2231,410 +2318,2471 @@
         <w:pStyle w:val="Numerada"/>
         <w:numPr>
           <w:ilvl w:val="0"/>
-          <w:numId w:val="32"/>
+          <w:numId w:val="0"/>
         </w:numPr>
+        <w:ind w:left="792"/>
         <w:rPr>
           <w:lang w:val="pt-BR"/>
         </w:rPr>
       </w:pPr>
-      <w:r>
-        <w:rPr>
-          <w:lang w:val="pt-BR" w:bidi="pt-BR"/>
-        </w:rPr>
-        <w:t xml:space="preserve">Na guia </w:t>
-      </w:r>
-      <w:r>
-        <w:rPr>
-          <w:rStyle w:val="Forte"/>
-          <w:lang w:val="pt-BR" w:bidi="pt-BR"/>
-        </w:rPr>
-        <w:t>Página Inicial</w:t>
-      </w:r>
-      <w:r>
-        <w:rPr>
-          <w:lang w:val="pt-BR" w:bidi="pt-BR"/>
-        </w:rPr>
-        <w:t xml:space="preserve">, localize </w:t>
-      </w:r>
-      <w:r>
-        <w:rPr>
-          <w:rStyle w:val="Forte"/>
-          <w:lang w:val="pt-BR" w:bidi="pt-BR"/>
-        </w:rPr>
-        <w:t>Estilos</w:t>
-      </w:r>
-      <w:r>
-        <w:rPr>
-          <w:lang w:val="pt-BR" w:bidi="pt-BR"/>
-        </w:rPr>
-        <w:t xml:space="preserve"> e selecione </w:t>
-      </w:r>
-      <w:r>
-        <w:rPr>
-          <w:rStyle w:val="Forte"/>
-          <w:lang w:val="pt-BR" w:bidi="pt-BR"/>
-        </w:rPr>
-        <w:t>Título 1</w:t>
-      </w:r>
-      <w:r>
-        <w:rPr>
-          <w:lang w:val="pt-BR" w:bidi="pt-BR"/>
-        </w:rPr>
-        <w:t xml:space="preserve"> (atalho de teclado: </w:t>
-      </w:r>
-      <w:r>
-        <w:rPr>
-          <w:lang w:val="pt-BR" w:bidi="pt-BR"/>
-        </w:rPr>
-        <w:t>Alt+Ctrl+1</w:t>
-      </w:r>
-      <w:r>
-        <w:rPr>
-          <w:lang w:val="pt-BR" w:bidi="pt-BR"/>
-        </w:rPr>
-        <w:t>).</w:t>
-      </w:r>
+    </w:p>
+    <w:p>
+      <w:pPr>
+        <w:rPr>
+          <w:lang w:val="en-US"/>
+        </w:rPr>
+      </w:pPr>
+      <w:r>
+        <w:rPr>
+          <w:highlight w:val="lightGray"/>
+          <w:lang w:val="en-US"/>
+        </w:rPr>
+        <w:t>dotnet tool install dotnet-</w:t>
+      </w:r>
+      <w:proofErr w:type="spellStart"/>
+      <w:r>
+        <w:rPr>
+          <w:highlight w:val="lightGray"/>
+          <w:lang w:val="en-US"/>
+        </w:rPr>
+        <w:t>ef</w:t>
+      </w:r>
+      <w:proofErr w:type="spellEnd"/>
+      <w:r>
+        <w:rPr>
+          <w:highlight w:val="lightGray"/>
+          <w:lang w:val="en-US"/>
+        </w:rPr>
+        <w:t xml:space="preserve"> --version 9.0.2</w:t>
+      </w:r>
+    </w:p>
+    <w:p>
+      <w:pPr>
+        <w:rPr>
+          <w:lang w:val="en-US"/>
+        </w:rPr>
+      </w:pPr>
     </w:p>
     <w:p>
       <w:pPr>
         <w:pStyle w:val="Numerada"/>
         <w:numPr>
           <w:ilvl w:val="0"/>
-          <w:numId w:val="32"/>
+          <w:numId w:val="38"/>
         </w:numPr>
         <w:rPr>
           <w:lang w:val="pt-BR"/>
         </w:rPr>
       </w:pPr>
-      <w:r>
-        <w:rPr>
-          <w:lang w:val="pt-BR" w:bidi="pt-BR"/>
-        </w:rPr>
-        <w:lastRenderedPageBreak/>
-        <w:t xml:space="preserve">Atualize o Sumário como fez antes, mas desta vez, selecione </w:t>
-      </w:r>
-      <w:r>
-        <w:rPr>
-          <w:rStyle w:val="Forte"/>
-          <w:lang w:val="pt-BR" w:bidi="pt-BR"/>
-        </w:rPr>
-        <w:t xml:space="preserve">Atualizar o índice inteiro </w:t>
-      </w:r>
-      <w:r>
-        <w:rPr>
-          <w:lang w:val="pt-BR" w:bidi="pt-BR"/>
-        </w:rPr>
-        <w:t xml:space="preserve">(em vez de </w:t>
-      </w:r>
-      <w:r>
-        <w:rPr>
-          <w:rStyle w:val="Forte"/>
-          <w:lang w:val="pt-BR" w:bidi="pt-BR"/>
-        </w:rPr>
-        <w:t>atualizar apenas os números d</w:t>
-      </w:r>
-      <w:r>
-        <w:rPr>
-          <w:rStyle w:val="Forte"/>
-          <w:lang w:val="pt-BR" w:bidi="pt-BR"/>
-        </w:rPr>
-        <w:t>e</w:t>
-      </w:r>
-      <w:r>
-        <w:rPr>
-          <w:rStyle w:val="Forte"/>
-          <w:lang w:val="pt-BR" w:bidi="pt-BR"/>
-        </w:rPr>
-        <w:t xml:space="preserve"> página</w:t>
-      </w:r>
-      <w:r>
-        <w:rPr>
-          <w:lang w:val="pt-BR" w:bidi="pt-BR"/>
-        </w:rPr>
-        <w:t xml:space="preserve">) já que mais do que os números das páginas foram alterados. </w:t>
-      </w:r>
+      <w:proofErr w:type="spellStart"/>
+      <w:r>
+        <w:rPr>
+          <w:lang w:val="pt-BR"/>
+        </w:rPr>
+        <w:t>Insera</w:t>
+      </w:r>
+      <w:proofErr w:type="spellEnd"/>
+      <w:r>
+        <w:rPr>
+          <w:lang w:val="pt-BR"/>
+        </w:rPr>
+        <w:t xml:space="preserve"> o código no seu </w:t>
+      </w:r>
+      <w:proofErr w:type="spellStart"/>
+      <w:r>
+        <w:rPr>
+          <w:lang w:val="pt-BR"/>
+        </w:rPr>
+        <w:t>Projeto</w:t>
+      </w:r>
+      <w:r>
+        <w:rPr>
+          <w:lang w:val="pt-BR"/>
+        </w:rPr>
+        <w:t>.csproj</w:t>
+      </w:r>
+      <w:proofErr w:type="spellEnd"/>
     </w:p>
     <w:p>
       <w:pPr>
-        <w:rPr>
-          <w:lang w:val="pt-BR"/>
+        <w:shd w:val="clear" w:color="auto" w:fill="121314"/>
+        <w:spacing w:before="0" w:line="285" w:lineRule="atLeast"/>
+        <w:rPr>
+          <w:rFonts w:ascii="Consolas" w:eastAsia="Times New Roman" w:hAnsi="Consolas" w:cs="Consolas"/>
+          <w:color w:val="BBBEBF"/>
+          <w:sz w:val="21"/>
+          <w:szCs w:val="21"/>
+          <w:lang w:val="en-US" w:eastAsia="pt-BR"/>
         </w:rPr>
       </w:pPr>
       <w:r>
         <w:rPr>
-          <w:lang w:val="pt-BR" w:bidi="pt-BR"/>
-        </w:rPr>
-        <w:t xml:space="preserve">O Word agora sabe que o parágrafo é um título e o inclui no Sumário. </w:t>
+          <w:rFonts w:ascii="Consolas" w:eastAsia="Times New Roman" w:hAnsi="Consolas" w:cs="Consolas"/>
+          <w:color w:val="808080"/>
+          <w:sz w:val="21"/>
+          <w:szCs w:val="21"/>
+          <w:lang w:val="en-US" w:eastAsia="pt-BR"/>
+        </w:rPr>
+        <w:t>&lt;</w:t>
+      </w:r>
+      <w:r>
+        <w:rPr>
+          <w:rFonts w:ascii="Consolas" w:eastAsia="Times New Roman" w:hAnsi="Consolas" w:cs="Consolas"/>
+          <w:color w:val="7EE787"/>
+          <w:sz w:val="21"/>
+          <w:szCs w:val="21"/>
+          <w:lang w:val="en-US" w:eastAsia="pt-BR"/>
+        </w:rPr>
+        <w:t>Project</w:t>
+      </w:r>
+      <w:r>
+        <w:rPr>
+          <w:rFonts w:ascii="Consolas" w:eastAsia="Times New Roman" w:hAnsi="Consolas" w:cs="Consolas"/>
+          <w:color w:val="BBBEBF"/>
+          <w:sz w:val="21"/>
+          <w:szCs w:val="21"/>
+          <w:lang w:val="en-US" w:eastAsia="pt-BR"/>
+        </w:rPr>
+        <w:t xml:space="preserve"> </w:t>
+      </w:r>
+      <w:proofErr w:type="spellStart"/>
+      <w:r>
+        <w:rPr>
+          <w:rFonts w:ascii="Consolas" w:eastAsia="Times New Roman" w:hAnsi="Consolas" w:cs="Consolas"/>
+          <w:color w:val="9CDCFE"/>
+          <w:sz w:val="21"/>
+          <w:szCs w:val="21"/>
+          <w:lang w:val="en-US" w:eastAsia="pt-BR"/>
+        </w:rPr>
+        <w:t>Sdk</w:t>
+      </w:r>
+      <w:proofErr w:type="spellEnd"/>
+      <w:r>
+        <w:rPr>
+          <w:rFonts w:ascii="Consolas" w:eastAsia="Times New Roman" w:hAnsi="Consolas" w:cs="Consolas"/>
+          <w:color w:val="BBBEBF"/>
+          <w:sz w:val="21"/>
+          <w:szCs w:val="21"/>
+          <w:lang w:val="en-US" w:eastAsia="pt-BR"/>
+        </w:rPr>
+        <w:t>=</w:t>
+      </w:r>
+      <w:r>
+        <w:rPr>
+          <w:rFonts w:ascii="Consolas" w:eastAsia="Times New Roman" w:hAnsi="Consolas" w:cs="Consolas"/>
+          <w:color w:val="A5D6FF"/>
+          <w:sz w:val="21"/>
+          <w:szCs w:val="21"/>
+          <w:lang w:val="en-US" w:eastAsia="pt-BR"/>
+        </w:rPr>
+        <w:t>"</w:t>
+      </w:r>
+      <w:proofErr w:type="spellStart"/>
+      <w:proofErr w:type="gramStart"/>
+      <w:r>
+        <w:rPr>
+          <w:rFonts w:ascii="Consolas" w:eastAsia="Times New Roman" w:hAnsi="Consolas" w:cs="Consolas"/>
+          <w:color w:val="A5D6FF"/>
+          <w:sz w:val="21"/>
+          <w:szCs w:val="21"/>
+          <w:lang w:val="en-US" w:eastAsia="pt-BR"/>
+        </w:rPr>
+        <w:t>Microsoft.NET.Sdk.Web</w:t>
+      </w:r>
+      <w:proofErr w:type="spellEnd"/>
+      <w:proofErr w:type="gramEnd"/>
+      <w:r>
+        <w:rPr>
+          <w:rFonts w:ascii="Consolas" w:eastAsia="Times New Roman" w:hAnsi="Consolas" w:cs="Consolas"/>
+          <w:color w:val="A5D6FF"/>
+          <w:sz w:val="21"/>
+          <w:szCs w:val="21"/>
+          <w:lang w:val="en-US" w:eastAsia="pt-BR"/>
+        </w:rPr>
+        <w:t>"</w:t>
+      </w:r>
+      <w:r>
+        <w:rPr>
+          <w:rFonts w:ascii="Consolas" w:eastAsia="Times New Roman" w:hAnsi="Consolas" w:cs="Consolas"/>
+          <w:color w:val="808080"/>
+          <w:sz w:val="21"/>
+          <w:szCs w:val="21"/>
+          <w:lang w:val="en-US" w:eastAsia="pt-BR"/>
+        </w:rPr>
+        <w:t>&gt;</w:t>
       </w:r>
     </w:p>
     <w:p>
       <w:pPr>
-        <w:pStyle w:val="Ttulo1"/>
-        <w:rPr>
-          <w:lang w:val="pt-BR"/>
-        </w:rPr>
-      </w:pPr>
-      <w:r>
-        <w:rPr>
-          <w:lang w:val="pt-BR" w:bidi="pt-BR"/>
-        </w:rPr>
-        <w:t>Ir mais além do que o Título 1</w:t>
-      </w:r>
-    </w:p>
-    <w:p>
-      <w:pPr>
-        <w:rPr>
-          <w:lang w:val="pt-BR"/>
-        </w:rPr>
-      </w:pPr>
-      <w:r>
-        <w:rPr>
-          <w:lang w:val="pt-BR" w:bidi="pt-BR"/>
-        </w:rPr>
-        <w:t xml:space="preserve">Quer mais níveis no Sumário? Aqui é onde o restante dos estilos de Título entrem. Marcar subtítulos em seu documento com Título 2, títulos de nível inferior com Título 3 e assim por diante. </w:t>
-      </w:r>
-    </w:p>
-    <w:p>
-      <w:pPr>
-        <w:rPr>
-          <w:lang w:val="pt-BR"/>
-        </w:rPr>
-      </w:pPr>
-      <w:r>
-        <w:rPr>
-          <w:rStyle w:val="nfase"/>
-          <w:lang w:val="pt-BR" w:bidi="pt-BR"/>
-        </w:rPr>
-        <w:t>Experimente:</w:t>
-      </w:r>
-      <w:r>
-        <w:rPr>
-          <w:lang w:val="pt-BR" w:bidi="pt-BR"/>
-        </w:rPr>
-        <w:t xml:space="preserve"> Aplique </w:t>
-      </w:r>
-      <w:r>
-        <w:rPr>
-          <w:rStyle w:val="Forte"/>
-          <w:lang w:val="pt-BR" w:bidi="pt-BR"/>
-        </w:rPr>
-        <w:t>Título 2</w:t>
-      </w:r>
-      <w:r>
-        <w:rPr>
-          <w:lang w:val="pt-BR" w:bidi="pt-BR"/>
-        </w:rPr>
-        <w:t xml:space="preserve"> no parágrafo abaixo (</w:t>
-      </w:r>
-      <w:r>
-        <w:rPr>
-          <w:rStyle w:val="Caracteredenfasedecitao"/>
-          <w:lang w:val="pt-BR" w:bidi="pt-BR"/>
-        </w:rPr>
-        <w:t>Adicionar uma entrada de Sumário Nível 2</w:t>
-      </w:r>
-      <w:r>
-        <w:rPr>
-          <w:lang w:val="pt-BR" w:bidi="pt-BR"/>
-        </w:rPr>
-        <w:t>) e atualize o Sumário como você fez antes. Lembre-se de atualizar o sumário inteiro!</w:t>
-      </w:r>
-    </w:p>
-    <w:p>
-      <w:pPr>
-        <w:rPr>
-          <w:lang w:val="pt-BR"/>
-        </w:rPr>
-      </w:pPr>
-      <w:r>
-        <w:rPr>
-          <w:lang w:val="pt-BR" w:bidi="pt-BR"/>
-        </w:rPr>
-        <w:t xml:space="preserve">Adicionar uma entrada de Sumário Nível 2 </w:t>
-      </w:r>
-    </w:p>
-    <w:p>
-      <w:pPr>
-        <w:rPr>
-          <w:lang w:val="pt-BR"/>
-        </w:rPr>
-      </w:pPr>
-      <w:r>
-        <w:rPr>
-          <w:rStyle w:val="Forte"/>
-          <w:lang w:val="pt-BR" w:bidi="pt-BR"/>
-        </w:rPr>
-        <w:t>Detalhes ocultos</w:t>
-      </w:r>
-      <w:r>
-        <w:rPr>
-          <w:rStyle w:val="Forte"/>
-        </w:rPr>
-        <w:t>:</w:t>
-      </w:r>
-      <w:r>
-        <w:rPr>
-          <w:lang w:val="pt-BR" w:bidi="pt-BR"/>
-        </w:rPr>
-        <w:t xml:space="preserve"> Os estilos de título mantêm a formatação, fonte, tamanho, cores e mais. Eles também mantêm um formato de parágrafo conhecido como </w:t>
-      </w:r>
-      <w:r>
-        <w:rPr>
-          <w:rStyle w:val="Caracteredenfasedecitao"/>
-          <w:lang w:val="pt-BR" w:bidi="pt-BR"/>
-        </w:rPr>
-        <w:t>nível de estrutura de tópicos</w:t>
-      </w:r>
-      <w:r>
-        <w:rPr>
-          <w:lang w:val="pt-BR" w:bidi="pt-BR"/>
-        </w:rPr>
-        <w:t xml:space="preserve">, que foi selecionado pelo Sumário. </w:t>
-      </w:r>
-    </w:p>
-    <w:p>
-      <w:pPr>
-        <w:pStyle w:val="Ttulo1"/>
-        <w:rPr>
-          <w:lang w:val="pt-BR"/>
-        </w:rPr>
-      </w:pPr>
-      <w:r>
-        <w:rPr>
-          <w:lang w:val="pt-BR" w:bidi="pt-BR"/>
-        </w:rPr>
-        <w:t xml:space="preserve">Explorar mais </w:t>
-      </w:r>
-    </w:p>
-    <w:p>
-      <w:pPr>
-        <w:rPr>
-          <w:lang w:val="pt-BR"/>
-        </w:rPr>
-      </w:pPr>
-      <w:r>
-        <w:rPr>
-          <w:lang w:val="pt-BR" w:bidi="pt-BR"/>
-        </w:rPr>
-        <w:t xml:space="preserve">Se você quiser personalizar ainda mais o Sumário, experimente isto. (Se você não adicionou o Sumário novamente, faça isso agora. Você pode adicioná-lo acima desta seção se desejar. Ou, se removê-lo foi a última coisa que você fez, pressione Ctrl + Z para desfazer.) </w:t>
-      </w:r>
-    </w:p>
-    <w:p>
-      <w:pPr>
-        <w:pStyle w:val="Ttulo2"/>
-        <w:rPr>
-          <w:lang w:val="pt-BR"/>
-        </w:rPr>
-      </w:pPr>
-      <w:r>
-        <w:rPr>
-          <w:lang w:val="pt-BR" w:bidi="pt-BR"/>
-        </w:rPr>
-        <w:t>Alterar a formatação do texto das entradas do Sumário</w:t>
-      </w:r>
-    </w:p>
-    <w:p>
-      <w:pPr>
-        <w:rPr>
-          <w:lang w:val="pt-BR"/>
-        </w:rPr>
-      </w:pPr>
-      <w:r>
-        <w:rPr>
-          <w:rStyle w:val="nfase"/>
-          <w:lang w:val="pt-BR" w:bidi="pt-BR"/>
-        </w:rPr>
-        <w:t>Experimente:</w:t>
-      </w:r>
-      <w:r>
-        <w:rPr>
-          <w:lang w:val="pt-BR" w:bidi="pt-BR"/>
-        </w:rPr>
-        <w:t xml:space="preserve"> No Sumário, selecione uma entrada de Nível 1 inteira e faça uma alteração de formatação. Por exemplo, alterar a cor da fonte para azul. (Verifique de selecionar apenas uma entrada de Sumário, incluindo o preenchimento de tabulação e o número da página. Observe que embora pareça que todo o Sumário está selecionado, a entrada que você selecionou estará mais escura.)</w:t>
-      </w:r>
-    </w:p>
-    <w:p>
-      <w:pPr>
-        <w:rPr>
-          <w:lang w:val="pt-BR"/>
+        <w:shd w:val="clear" w:color="auto" w:fill="121314"/>
+        <w:spacing w:before="0" w:line="285" w:lineRule="atLeast"/>
+        <w:rPr>
+          <w:rFonts w:ascii="Consolas" w:eastAsia="Times New Roman" w:hAnsi="Consolas" w:cs="Consolas"/>
+          <w:color w:val="BBBEBF"/>
+          <w:sz w:val="21"/>
+          <w:szCs w:val="21"/>
+          <w:lang w:val="en-US" w:eastAsia="pt-BR"/>
         </w:rPr>
       </w:pPr>
     </w:p>
     <w:p>
       <w:pPr>
-        <w:rPr>
-          <w:lang w:val="pt-BR"/>
+        <w:shd w:val="clear" w:color="auto" w:fill="121314"/>
+        <w:spacing w:before="0" w:line="285" w:lineRule="atLeast"/>
+        <w:rPr>
+          <w:rFonts w:ascii="Consolas" w:eastAsia="Times New Roman" w:hAnsi="Consolas" w:cs="Consolas"/>
+          <w:color w:val="BBBEBF"/>
+          <w:sz w:val="21"/>
+          <w:szCs w:val="21"/>
+          <w:lang w:val="en-US" w:eastAsia="pt-BR"/>
         </w:rPr>
       </w:pPr>
       <w:r>
         <w:rPr>
-          <w:lang w:val="pt-BR" w:bidi="pt-BR"/>
-        </w:rPr>
-        <w:t xml:space="preserve">Como o restante da mágica do Sumário, todas as entradas de Nível 1 do sumário serão alteradas. </w:t>
+          <w:rFonts w:ascii="Consolas" w:eastAsia="Times New Roman" w:hAnsi="Consolas" w:cs="Consolas"/>
+          <w:color w:val="BBBEBF"/>
+          <w:sz w:val="21"/>
+          <w:szCs w:val="21"/>
+          <w:lang w:val="en-US" w:eastAsia="pt-BR"/>
+        </w:rPr>
+        <w:t xml:space="preserve">  </w:t>
+      </w:r>
+      <w:r>
+        <w:rPr>
+          <w:rFonts w:ascii="Consolas" w:eastAsia="Times New Roman" w:hAnsi="Consolas" w:cs="Consolas"/>
+          <w:color w:val="808080"/>
+          <w:sz w:val="21"/>
+          <w:szCs w:val="21"/>
+          <w:lang w:val="en-US" w:eastAsia="pt-BR"/>
+        </w:rPr>
+        <w:t>&lt;</w:t>
+      </w:r>
+      <w:proofErr w:type="spellStart"/>
+      <w:r>
+        <w:rPr>
+          <w:rFonts w:ascii="Consolas" w:eastAsia="Times New Roman" w:hAnsi="Consolas" w:cs="Consolas"/>
+          <w:color w:val="7EE787"/>
+          <w:sz w:val="21"/>
+          <w:szCs w:val="21"/>
+          <w:lang w:val="en-US" w:eastAsia="pt-BR"/>
+        </w:rPr>
+        <w:t>PropertyGroup</w:t>
+      </w:r>
+      <w:proofErr w:type="spellEnd"/>
+      <w:r>
+        <w:rPr>
+          <w:rFonts w:ascii="Consolas" w:eastAsia="Times New Roman" w:hAnsi="Consolas" w:cs="Consolas"/>
+          <w:color w:val="808080"/>
+          <w:sz w:val="21"/>
+          <w:szCs w:val="21"/>
+          <w:lang w:val="en-US" w:eastAsia="pt-BR"/>
+        </w:rPr>
+        <w:t>&gt;</w:t>
       </w:r>
     </w:p>
     <w:p>
       <w:pPr>
-        <w:rPr>
-          <w:lang w:val="pt-BR"/>
+        <w:shd w:val="clear" w:color="auto" w:fill="121314"/>
+        <w:spacing w:before="0" w:line="285" w:lineRule="atLeast"/>
+        <w:rPr>
+          <w:rFonts w:ascii="Consolas" w:eastAsia="Times New Roman" w:hAnsi="Consolas" w:cs="Consolas"/>
+          <w:color w:val="BBBEBF"/>
+          <w:sz w:val="21"/>
+          <w:szCs w:val="21"/>
+          <w:lang w:val="pt-BR" w:eastAsia="pt-BR"/>
         </w:rPr>
       </w:pPr>
       <w:r>
         <w:rPr>
-          <w:rStyle w:val="Forte"/>
-          <w:lang w:val="pt-BR" w:bidi="pt-BR"/>
-        </w:rPr>
-        <w:t>Detalhes ocultos:</w:t>
-      </w:r>
-      <w:r>
-        <w:rPr>
-          <w:lang w:val="pt-BR" w:bidi="pt-BR"/>
-        </w:rPr>
-        <w:t xml:space="preserve"> Ok, não é realmente mágica. As entradas do Sumário são atribuídas a um estilo de (Sumário1, Sumário 2 e assim por diante) e os estilos são definidos para atualizar automaticamente sempre que você fizer uma alteração na formatação.</w:t>
+          <w:rFonts w:ascii="Consolas" w:eastAsia="Times New Roman" w:hAnsi="Consolas" w:cs="Consolas"/>
+          <w:color w:val="BBBEBF"/>
+          <w:sz w:val="21"/>
+          <w:szCs w:val="21"/>
+          <w:lang w:val="en-US" w:eastAsia="pt-BR"/>
+        </w:rPr>
+        <w:t xml:space="preserve">    </w:t>
+      </w:r>
+      <w:proofErr w:type="gramStart"/>
+      <w:r>
+        <w:rPr>
+          <w:rFonts w:ascii="Consolas" w:eastAsia="Times New Roman" w:hAnsi="Consolas" w:cs="Consolas"/>
+          <w:color w:val="8B949E"/>
+          <w:sz w:val="21"/>
+          <w:szCs w:val="21"/>
+          <w:lang w:val="pt-BR" w:eastAsia="pt-BR"/>
+        </w:rPr>
+        <w:t>&lt;!--</w:t>
+      </w:r>
+      <w:proofErr w:type="gramEnd"/>
+      <w:r>
+        <w:rPr>
+          <w:rFonts w:ascii="Consolas" w:eastAsia="Times New Roman" w:hAnsi="Consolas" w:cs="Consolas"/>
+          <w:color w:val="8B949E"/>
+          <w:sz w:val="21"/>
+          <w:szCs w:val="21"/>
+          <w:lang w:val="pt-BR" w:eastAsia="pt-BR"/>
+        </w:rPr>
+        <w:t xml:space="preserve"> Alterado de net10.0 para net9.0 --&gt;</w:t>
       </w:r>
     </w:p>
     <w:p>
       <w:pPr>
-        <w:pStyle w:val="Ttulo2"/>
-        <w:rPr>
-          <w:lang w:val="pt-BR"/>
+        <w:shd w:val="clear" w:color="auto" w:fill="121314"/>
+        <w:spacing w:before="0" w:line="285" w:lineRule="atLeast"/>
+        <w:rPr>
+          <w:rFonts w:ascii="Consolas" w:eastAsia="Times New Roman" w:hAnsi="Consolas" w:cs="Consolas"/>
+          <w:color w:val="BBBEBF"/>
+          <w:sz w:val="21"/>
+          <w:szCs w:val="21"/>
+          <w:lang w:val="en-US" w:eastAsia="pt-BR"/>
         </w:rPr>
       </w:pPr>
       <w:r>
         <w:rPr>
-          <w:lang w:val="pt-BR" w:bidi="pt-BR"/>
-        </w:rPr>
-        <w:lastRenderedPageBreak/>
-        <w:t>Alterar o número de níveis do Sumário</w:t>
+          <w:rFonts w:ascii="Consolas" w:eastAsia="Times New Roman" w:hAnsi="Consolas" w:cs="Consolas"/>
+          <w:color w:val="BBBEBF"/>
+          <w:sz w:val="21"/>
+          <w:szCs w:val="21"/>
+          <w:lang w:val="pt-BR" w:eastAsia="pt-BR"/>
+        </w:rPr>
+        <w:t xml:space="preserve">    </w:t>
+      </w:r>
+      <w:r>
+        <w:rPr>
+          <w:rFonts w:ascii="Consolas" w:eastAsia="Times New Roman" w:hAnsi="Consolas" w:cs="Consolas"/>
+          <w:color w:val="808080"/>
+          <w:sz w:val="21"/>
+          <w:szCs w:val="21"/>
+          <w:lang w:val="en-US" w:eastAsia="pt-BR"/>
+        </w:rPr>
+        <w:t>&lt;</w:t>
+      </w:r>
+      <w:proofErr w:type="spellStart"/>
+      <w:r>
+        <w:rPr>
+          <w:rFonts w:ascii="Consolas" w:eastAsia="Times New Roman" w:hAnsi="Consolas" w:cs="Consolas"/>
+          <w:color w:val="7EE787"/>
+          <w:sz w:val="21"/>
+          <w:szCs w:val="21"/>
+          <w:lang w:val="en-US" w:eastAsia="pt-BR"/>
+        </w:rPr>
+        <w:t>TargetFramework</w:t>
+      </w:r>
+      <w:proofErr w:type="spellEnd"/>
+      <w:r>
+        <w:rPr>
+          <w:rFonts w:ascii="Consolas" w:eastAsia="Times New Roman" w:hAnsi="Consolas" w:cs="Consolas"/>
+          <w:color w:val="808080"/>
+          <w:sz w:val="21"/>
+          <w:szCs w:val="21"/>
+          <w:lang w:val="en-US" w:eastAsia="pt-BR"/>
+        </w:rPr>
+        <w:t>&gt;</w:t>
+      </w:r>
+      <w:r>
+        <w:rPr>
+          <w:rFonts w:ascii="Consolas" w:eastAsia="Times New Roman" w:hAnsi="Consolas" w:cs="Consolas"/>
+          <w:color w:val="BBBEBF"/>
+          <w:sz w:val="21"/>
+          <w:szCs w:val="21"/>
+          <w:lang w:val="en-US" w:eastAsia="pt-BR"/>
+        </w:rPr>
+        <w:t>net9.0</w:t>
+      </w:r>
+      <w:r>
+        <w:rPr>
+          <w:rFonts w:ascii="Consolas" w:eastAsia="Times New Roman" w:hAnsi="Consolas" w:cs="Consolas"/>
+          <w:color w:val="808080"/>
+          <w:sz w:val="21"/>
+          <w:szCs w:val="21"/>
+          <w:lang w:val="en-US" w:eastAsia="pt-BR"/>
+        </w:rPr>
+        <w:t>&lt;/</w:t>
+      </w:r>
+      <w:proofErr w:type="spellStart"/>
+      <w:r>
+        <w:rPr>
+          <w:rFonts w:ascii="Consolas" w:eastAsia="Times New Roman" w:hAnsi="Consolas" w:cs="Consolas"/>
+          <w:color w:val="7EE787"/>
+          <w:sz w:val="21"/>
+          <w:szCs w:val="21"/>
+          <w:lang w:val="en-US" w:eastAsia="pt-BR"/>
+        </w:rPr>
+        <w:t>TargetFramework</w:t>
+      </w:r>
+      <w:proofErr w:type="spellEnd"/>
+      <w:r>
+        <w:rPr>
+          <w:rFonts w:ascii="Consolas" w:eastAsia="Times New Roman" w:hAnsi="Consolas" w:cs="Consolas"/>
+          <w:color w:val="808080"/>
+          <w:sz w:val="21"/>
+          <w:szCs w:val="21"/>
+          <w:lang w:val="en-US" w:eastAsia="pt-BR"/>
+        </w:rPr>
+        <w:t>&gt;</w:t>
+      </w:r>
+      <w:r>
+        <w:rPr>
+          <w:rFonts w:ascii="Consolas" w:eastAsia="Times New Roman" w:hAnsi="Consolas" w:cs="Consolas"/>
+          <w:color w:val="BBBEBF"/>
+          <w:sz w:val="21"/>
+          <w:szCs w:val="21"/>
+          <w:lang w:val="en-US" w:eastAsia="pt-BR"/>
+        </w:rPr>
+        <w:t xml:space="preserve"> </w:t>
       </w:r>
     </w:p>
     <w:p>
       <w:pPr>
-        <w:keepNext/>
-        <w:rPr>
-          <w:lang w:val="pt-BR"/>
+        <w:shd w:val="clear" w:color="auto" w:fill="121314"/>
+        <w:spacing w:before="0" w:line="285" w:lineRule="atLeast"/>
+        <w:rPr>
+          <w:rFonts w:ascii="Consolas" w:eastAsia="Times New Roman" w:hAnsi="Consolas" w:cs="Consolas"/>
+          <w:color w:val="BBBEBF"/>
+          <w:sz w:val="21"/>
+          <w:szCs w:val="21"/>
+          <w:lang w:val="en-US" w:eastAsia="pt-BR"/>
         </w:rPr>
       </w:pPr>
       <w:r>
         <w:rPr>
-          <w:rStyle w:val="nfase"/>
-          <w:lang w:val="pt-BR" w:bidi="pt-BR"/>
-        </w:rPr>
-        <w:t>Experimente:</w:t>
-      </w:r>
-      <w:r>
-        <w:rPr>
-          <w:lang w:val="pt-BR" w:bidi="pt-BR"/>
-        </w:rPr>
-        <w:t xml:space="preserve"> Inclua somente títulos do Título 1 títulos no Sumário, não subtítulos.</w:t>
-      </w:r>
+          <w:rFonts w:ascii="Consolas" w:eastAsia="Times New Roman" w:hAnsi="Consolas" w:cs="Consolas"/>
+          <w:color w:val="BBBEBF"/>
+          <w:sz w:val="21"/>
+          <w:szCs w:val="21"/>
+          <w:lang w:val="en-US" w:eastAsia="pt-BR"/>
+        </w:rPr>
+        <w:t xml:space="preserve">    </w:t>
+      </w:r>
+      <w:r>
+        <w:rPr>
+          <w:rFonts w:ascii="Consolas" w:eastAsia="Times New Roman" w:hAnsi="Consolas" w:cs="Consolas"/>
+          <w:color w:val="808080"/>
+          <w:sz w:val="21"/>
+          <w:szCs w:val="21"/>
+          <w:lang w:val="en-US" w:eastAsia="pt-BR"/>
+        </w:rPr>
+        <w:t>&lt;</w:t>
+      </w:r>
+      <w:r>
+        <w:rPr>
+          <w:rFonts w:ascii="Consolas" w:eastAsia="Times New Roman" w:hAnsi="Consolas" w:cs="Consolas"/>
+          <w:color w:val="7EE787"/>
+          <w:sz w:val="21"/>
+          <w:szCs w:val="21"/>
+          <w:lang w:val="en-US" w:eastAsia="pt-BR"/>
+        </w:rPr>
+        <w:t>Nullable</w:t>
+      </w:r>
+      <w:r>
+        <w:rPr>
+          <w:rFonts w:ascii="Consolas" w:eastAsia="Times New Roman" w:hAnsi="Consolas" w:cs="Consolas"/>
+          <w:color w:val="808080"/>
+          <w:sz w:val="21"/>
+          <w:szCs w:val="21"/>
+          <w:lang w:val="en-US" w:eastAsia="pt-BR"/>
+        </w:rPr>
+        <w:t>&gt;</w:t>
+      </w:r>
+      <w:r>
+        <w:rPr>
+          <w:rFonts w:ascii="Consolas" w:eastAsia="Times New Roman" w:hAnsi="Consolas" w:cs="Consolas"/>
+          <w:color w:val="BBBEBF"/>
+          <w:sz w:val="21"/>
+          <w:szCs w:val="21"/>
+          <w:lang w:val="en-US" w:eastAsia="pt-BR"/>
+        </w:rPr>
+        <w:t>enable</w:t>
+      </w:r>
+      <w:r>
+        <w:rPr>
+          <w:rFonts w:ascii="Consolas" w:eastAsia="Times New Roman" w:hAnsi="Consolas" w:cs="Consolas"/>
+          <w:color w:val="808080"/>
+          <w:sz w:val="21"/>
+          <w:szCs w:val="21"/>
+          <w:lang w:val="en-US" w:eastAsia="pt-BR"/>
+        </w:rPr>
+        <w:t>&lt;/</w:t>
+      </w:r>
+      <w:r>
+        <w:rPr>
+          <w:rFonts w:ascii="Consolas" w:eastAsia="Times New Roman" w:hAnsi="Consolas" w:cs="Consolas"/>
+          <w:color w:val="7EE787"/>
+          <w:sz w:val="21"/>
+          <w:szCs w:val="21"/>
+          <w:lang w:val="en-US" w:eastAsia="pt-BR"/>
+        </w:rPr>
+        <w:t>Nullable</w:t>
+      </w:r>
+      <w:r>
+        <w:rPr>
+          <w:rFonts w:ascii="Consolas" w:eastAsia="Times New Roman" w:hAnsi="Consolas" w:cs="Consolas"/>
+          <w:color w:val="808080"/>
+          <w:sz w:val="21"/>
+          <w:szCs w:val="21"/>
+          <w:lang w:val="en-US" w:eastAsia="pt-BR"/>
+        </w:rPr>
+        <w:t>&gt;</w:t>
+      </w:r>
+    </w:p>
+    <w:p>
+      <w:pPr>
+        <w:shd w:val="clear" w:color="auto" w:fill="121314"/>
+        <w:spacing w:before="0" w:line="285" w:lineRule="atLeast"/>
+        <w:rPr>
+          <w:rFonts w:ascii="Consolas" w:eastAsia="Times New Roman" w:hAnsi="Consolas" w:cs="Consolas"/>
+          <w:color w:val="BBBEBF"/>
+          <w:sz w:val="21"/>
+          <w:szCs w:val="21"/>
+          <w:lang w:val="en-US" w:eastAsia="pt-BR"/>
+        </w:rPr>
+      </w:pPr>
+      <w:r>
+        <w:rPr>
+          <w:rFonts w:ascii="Consolas" w:eastAsia="Times New Roman" w:hAnsi="Consolas" w:cs="Consolas"/>
+          <w:color w:val="BBBEBF"/>
+          <w:sz w:val="21"/>
+          <w:szCs w:val="21"/>
+          <w:lang w:val="en-US" w:eastAsia="pt-BR"/>
+        </w:rPr>
+        <w:t xml:space="preserve">    </w:t>
+      </w:r>
+      <w:r>
+        <w:rPr>
+          <w:rFonts w:ascii="Consolas" w:eastAsia="Times New Roman" w:hAnsi="Consolas" w:cs="Consolas"/>
+          <w:color w:val="808080"/>
+          <w:sz w:val="21"/>
+          <w:szCs w:val="21"/>
+          <w:lang w:val="en-US" w:eastAsia="pt-BR"/>
+        </w:rPr>
+        <w:t>&lt;</w:t>
+      </w:r>
+      <w:r>
+        <w:rPr>
+          <w:rFonts w:ascii="Consolas" w:eastAsia="Times New Roman" w:hAnsi="Consolas" w:cs="Consolas"/>
+          <w:color w:val="7EE787"/>
+          <w:sz w:val="21"/>
+          <w:szCs w:val="21"/>
+          <w:lang w:val="en-US" w:eastAsia="pt-BR"/>
+        </w:rPr>
+        <w:t>ImplicitUsings</w:t>
+      </w:r>
+      <w:r>
+        <w:rPr>
+          <w:rFonts w:ascii="Consolas" w:eastAsia="Times New Roman" w:hAnsi="Consolas" w:cs="Consolas"/>
+          <w:color w:val="808080"/>
+          <w:sz w:val="21"/>
+          <w:szCs w:val="21"/>
+          <w:lang w:val="en-US" w:eastAsia="pt-BR"/>
+        </w:rPr>
+        <w:t>&gt;</w:t>
+      </w:r>
+      <w:r>
+        <w:rPr>
+          <w:rFonts w:ascii="Consolas" w:eastAsia="Times New Roman" w:hAnsi="Consolas" w:cs="Consolas"/>
+          <w:color w:val="BBBEBF"/>
+          <w:sz w:val="21"/>
+          <w:szCs w:val="21"/>
+          <w:lang w:val="en-US" w:eastAsia="pt-BR"/>
+        </w:rPr>
+        <w:t>enable</w:t>
+      </w:r>
+      <w:r>
+        <w:rPr>
+          <w:rFonts w:ascii="Consolas" w:eastAsia="Times New Roman" w:hAnsi="Consolas" w:cs="Consolas"/>
+          <w:color w:val="808080"/>
+          <w:sz w:val="21"/>
+          <w:szCs w:val="21"/>
+          <w:lang w:val="en-US" w:eastAsia="pt-BR"/>
+        </w:rPr>
+        <w:t>&lt;/</w:t>
+      </w:r>
+      <w:r>
+        <w:rPr>
+          <w:rFonts w:ascii="Consolas" w:eastAsia="Times New Roman" w:hAnsi="Consolas" w:cs="Consolas"/>
+          <w:color w:val="7EE787"/>
+          <w:sz w:val="21"/>
+          <w:szCs w:val="21"/>
+          <w:lang w:val="en-US" w:eastAsia="pt-BR"/>
+        </w:rPr>
+        <w:t>ImplicitUsings</w:t>
+      </w:r>
+      <w:r>
+        <w:rPr>
+          <w:rFonts w:ascii="Consolas" w:eastAsia="Times New Roman" w:hAnsi="Consolas" w:cs="Consolas"/>
+          <w:color w:val="808080"/>
+          <w:sz w:val="21"/>
+          <w:szCs w:val="21"/>
+          <w:lang w:val="en-US" w:eastAsia="pt-BR"/>
+        </w:rPr>
+        <w:t>&gt;</w:t>
+      </w:r>
+    </w:p>
+    <w:p>
+      <w:pPr>
+        <w:shd w:val="clear" w:color="auto" w:fill="121314"/>
+        <w:spacing w:before="0" w:line="285" w:lineRule="atLeast"/>
+        <w:rPr>
+          <w:rFonts w:ascii="Consolas" w:eastAsia="Times New Roman" w:hAnsi="Consolas" w:cs="Consolas"/>
+          <w:color w:val="BBBEBF"/>
+          <w:sz w:val="21"/>
+          <w:szCs w:val="21"/>
+          <w:lang w:val="en-US" w:eastAsia="pt-BR"/>
+        </w:rPr>
+      </w:pPr>
+      <w:r>
+        <w:rPr>
+          <w:rFonts w:ascii="Consolas" w:eastAsia="Times New Roman" w:hAnsi="Consolas" w:cs="Consolas"/>
+          <w:color w:val="BBBEBF"/>
+          <w:sz w:val="21"/>
+          <w:szCs w:val="21"/>
+          <w:lang w:val="en-US" w:eastAsia="pt-BR"/>
+        </w:rPr>
+        <w:t xml:space="preserve">  </w:t>
+      </w:r>
+      <w:r>
+        <w:rPr>
+          <w:rFonts w:ascii="Consolas" w:eastAsia="Times New Roman" w:hAnsi="Consolas" w:cs="Consolas"/>
+          <w:color w:val="808080"/>
+          <w:sz w:val="21"/>
+          <w:szCs w:val="21"/>
+          <w:lang w:val="en-US" w:eastAsia="pt-BR"/>
+        </w:rPr>
+        <w:t>&lt;/</w:t>
+      </w:r>
+      <w:proofErr w:type="spellStart"/>
+      <w:r>
+        <w:rPr>
+          <w:rFonts w:ascii="Consolas" w:eastAsia="Times New Roman" w:hAnsi="Consolas" w:cs="Consolas"/>
+          <w:color w:val="7EE787"/>
+          <w:sz w:val="21"/>
+          <w:szCs w:val="21"/>
+          <w:lang w:val="en-US" w:eastAsia="pt-BR"/>
+        </w:rPr>
+        <w:t>PropertyGroup</w:t>
+      </w:r>
+      <w:proofErr w:type="spellEnd"/>
+      <w:r>
+        <w:rPr>
+          <w:rFonts w:ascii="Consolas" w:eastAsia="Times New Roman" w:hAnsi="Consolas" w:cs="Consolas"/>
+          <w:color w:val="808080"/>
+          <w:sz w:val="21"/>
+          <w:szCs w:val="21"/>
+          <w:lang w:val="en-US" w:eastAsia="pt-BR"/>
+        </w:rPr>
+        <w:t>&gt;</w:t>
+      </w:r>
+    </w:p>
+    <w:p>
+      <w:pPr>
+        <w:shd w:val="clear" w:color="auto" w:fill="121314"/>
+        <w:spacing w:before="0" w:line="285" w:lineRule="atLeast"/>
+        <w:rPr>
+          <w:rFonts w:ascii="Consolas" w:eastAsia="Times New Roman" w:hAnsi="Consolas" w:cs="Consolas"/>
+          <w:color w:val="BBBEBF"/>
+          <w:sz w:val="21"/>
+          <w:szCs w:val="21"/>
+          <w:lang w:val="en-US" w:eastAsia="pt-BR"/>
+        </w:rPr>
+      </w:pPr>
+    </w:p>
+    <w:p>
+      <w:pPr>
+        <w:shd w:val="clear" w:color="auto" w:fill="121314"/>
+        <w:spacing w:before="0" w:line="285" w:lineRule="atLeast"/>
+        <w:rPr>
+          <w:rFonts w:ascii="Consolas" w:eastAsia="Times New Roman" w:hAnsi="Consolas" w:cs="Consolas"/>
+          <w:color w:val="BBBEBF"/>
+          <w:sz w:val="21"/>
+          <w:szCs w:val="21"/>
+          <w:lang w:val="en-US" w:eastAsia="pt-BR"/>
+        </w:rPr>
+      </w:pPr>
+      <w:r>
+        <w:rPr>
+          <w:rFonts w:ascii="Consolas" w:eastAsia="Times New Roman" w:hAnsi="Consolas" w:cs="Consolas"/>
+          <w:color w:val="BBBEBF"/>
+          <w:sz w:val="21"/>
+          <w:szCs w:val="21"/>
+          <w:lang w:val="en-US" w:eastAsia="pt-BR"/>
+        </w:rPr>
+        <w:t xml:space="preserve">  </w:t>
+      </w:r>
+      <w:r>
+        <w:rPr>
+          <w:rFonts w:ascii="Consolas" w:eastAsia="Times New Roman" w:hAnsi="Consolas" w:cs="Consolas"/>
+          <w:color w:val="808080"/>
+          <w:sz w:val="21"/>
+          <w:szCs w:val="21"/>
+          <w:lang w:val="en-US" w:eastAsia="pt-BR"/>
+        </w:rPr>
+        <w:t>&lt;</w:t>
+      </w:r>
+      <w:proofErr w:type="spellStart"/>
+      <w:r>
+        <w:rPr>
+          <w:rFonts w:ascii="Consolas" w:eastAsia="Times New Roman" w:hAnsi="Consolas" w:cs="Consolas"/>
+          <w:color w:val="7EE787"/>
+          <w:sz w:val="21"/>
+          <w:szCs w:val="21"/>
+          <w:lang w:val="en-US" w:eastAsia="pt-BR"/>
+        </w:rPr>
+        <w:t>ItemGroup</w:t>
+      </w:r>
+      <w:proofErr w:type="spellEnd"/>
+      <w:r>
+        <w:rPr>
+          <w:rFonts w:ascii="Consolas" w:eastAsia="Times New Roman" w:hAnsi="Consolas" w:cs="Consolas"/>
+          <w:color w:val="808080"/>
+          <w:sz w:val="21"/>
+          <w:szCs w:val="21"/>
+          <w:lang w:val="en-US" w:eastAsia="pt-BR"/>
+        </w:rPr>
+        <w:t>&gt;</w:t>
+      </w:r>
+    </w:p>
+    <w:p>
+      <w:pPr>
+        <w:shd w:val="clear" w:color="auto" w:fill="121314"/>
+        <w:spacing w:before="0" w:line="285" w:lineRule="atLeast"/>
+        <w:rPr>
+          <w:rFonts w:ascii="Consolas" w:eastAsia="Times New Roman" w:hAnsi="Consolas" w:cs="Consolas"/>
+          <w:color w:val="BBBEBF"/>
+          <w:sz w:val="21"/>
+          <w:szCs w:val="21"/>
+          <w:lang w:val="en-US" w:eastAsia="pt-BR"/>
+        </w:rPr>
+      </w:pPr>
+      <w:r>
+        <w:rPr>
+          <w:rFonts w:ascii="Consolas" w:eastAsia="Times New Roman" w:hAnsi="Consolas" w:cs="Consolas"/>
+          <w:color w:val="BBBEBF"/>
+          <w:sz w:val="21"/>
+          <w:szCs w:val="21"/>
+          <w:lang w:val="en-US" w:eastAsia="pt-BR"/>
+        </w:rPr>
+        <w:t xml:space="preserve">    </w:t>
+      </w:r>
+      <w:r>
+        <w:rPr>
+          <w:rFonts w:ascii="Consolas" w:eastAsia="Times New Roman" w:hAnsi="Consolas" w:cs="Consolas"/>
+          <w:color w:val="808080"/>
+          <w:sz w:val="21"/>
+          <w:szCs w:val="21"/>
+          <w:lang w:val="en-US" w:eastAsia="pt-BR"/>
+        </w:rPr>
+        <w:t>&lt;</w:t>
+      </w:r>
+      <w:proofErr w:type="spellStart"/>
+      <w:r>
+        <w:rPr>
+          <w:rFonts w:ascii="Consolas" w:eastAsia="Times New Roman" w:hAnsi="Consolas" w:cs="Consolas"/>
+          <w:color w:val="7EE787"/>
+          <w:sz w:val="21"/>
+          <w:szCs w:val="21"/>
+          <w:lang w:val="en-US" w:eastAsia="pt-BR"/>
+        </w:rPr>
+        <w:t>PackageReference</w:t>
+      </w:r>
+      <w:proofErr w:type="spellEnd"/>
+      <w:r>
+        <w:rPr>
+          <w:rFonts w:ascii="Consolas" w:eastAsia="Times New Roman" w:hAnsi="Consolas" w:cs="Consolas"/>
+          <w:color w:val="BBBEBF"/>
+          <w:sz w:val="21"/>
+          <w:szCs w:val="21"/>
+          <w:lang w:val="en-US" w:eastAsia="pt-BR"/>
+        </w:rPr>
+        <w:t xml:space="preserve"> </w:t>
+      </w:r>
+      <w:r>
+        <w:rPr>
+          <w:rFonts w:ascii="Consolas" w:eastAsia="Times New Roman" w:hAnsi="Consolas" w:cs="Consolas"/>
+          <w:color w:val="9CDCFE"/>
+          <w:sz w:val="21"/>
+          <w:szCs w:val="21"/>
+          <w:lang w:val="en-US" w:eastAsia="pt-BR"/>
+        </w:rPr>
+        <w:t>Include</w:t>
+      </w:r>
+      <w:r>
+        <w:rPr>
+          <w:rFonts w:ascii="Consolas" w:eastAsia="Times New Roman" w:hAnsi="Consolas" w:cs="Consolas"/>
+          <w:color w:val="BBBEBF"/>
+          <w:sz w:val="21"/>
+          <w:szCs w:val="21"/>
+          <w:lang w:val="en-US" w:eastAsia="pt-BR"/>
+        </w:rPr>
+        <w:t>=</w:t>
+      </w:r>
+      <w:r>
+        <w:rPr>
+          <w:rFonts w:ascii="Consolas" w:eastAsia="Times New Roman" w:hAnsi="Consolas" w:cs="Consolas"/>
+          <w:color w:val="A5D6FF"/>
+          <w:sz w:val="21"/>
+          <w:szCs w:val="21"/>
+          <w:lang w:val="en-US" w:eastAsia="pt-BR"/>
+        </w:rPr>
+        <w:t>"</w:t>
+      </w:r>
+      <w:proofErr w:type="spellStart"/>
+      <w:r>
+        <w:rPr>
+          <w:rFonts w:ascii="Consolas" w:eastAsia="Times New Roman" w:hAnsi="Consolas" w:cs="Consolas"/>
+          <w:color w:val="A5D6FF"/>
+          <w:sz w:val="21"/>
+          <w:szCs w:val="21"/>
+          <w:lang w:val="en-US" w:eastAsia="pt-BR"/>
+        </w:rPr>
+        <w:t>Microsoft.EntityFrameworkCore</w:t>
+      </w:r>
+      <w:proofErr w:type="spellEnd"/>
+      <w:r>
+        <w:rPr>
+          <w:rFonts w:ascii="Consolas" w:eastAsia="Times New Roman" w:hAnsi="Consolas" w:cs="Consolas"/>
+          <w:color w:val="A5D6FF"/>
+          <w:sz w:val="21"/>
+          <w:szCs w:val="21"/>
+          <w:lang w:val="en-US" w:eastAsia="pt-BR"/>
+        </w:rPr>
+        <w:t>"</w:t>
+      </w:r>
+      <w:r>
+        <w:rPr>
+          <w:rFonts w:ascii="Consolas" w:eastAsia="Times New Roman" w:hAnsi="Consolas" w:cs="Consolas"/>
+          <w:color w:val="BBBEBF"/>
+          <w:sz w:val="21"/>
+          <w:szCs w:val="21"/>
+          <w:lang w:val="en-US" w:eastAsia="pt-BR"/>
+        </w:rPr>
+        <w:t xml:space="preserve"> </w:t>
+      </w:r>
+      <w:r>
+        <w:rPr>
+          <w:rFonts w:ascii="Consolas" w:eastAsia="Times New Roman" w:hAnsi="Consolas" w:cs="Consolas"/>
+          <w:color w:val="9CDCFE"/>
+          <w:sz w:val="21"/>
+          <w:szCs w:val="21"/>
+          <w:lang w:val="en-US" w:eastAsia="pt-BR"/>
+        </w:rPr>
+        <w:t>Version</w:t>
+      </w:r>
+      <w:r>
+        <w:rPr>
+          <w:rFonts w:ascii="Consolas" w:eastAsia="Times New Roman" w:hAnsi="Consolas" w:cs="Consolas"/>
+          <w:color w:val="BBBEBF"/>
+          <w:sz w:val="21"/>
+          <w:szCs w:val="21"/>
+          <w:lang w:val="en-US" w:eastAsia="pt-BR"/>
+        </w:rPr>
+        <w:t>=</w:t>
+      </w:r>
+      <w:r>
+        <w:rPr>
+          <w:rFonts w:ascii="Consolas" w:eastAsia="Times New Roman" w:hAnsi="Consolas" w:cs="Consolas"/>
+          <w:color w:val="A5D6FF"/>
+          <w:sz w:val="21"/>
+          <w:szCs w:val="21"/>
+          <w:lang w:val="en-US" w:eastAsia="pt-BR"/>
+        </w:rPr>
+        <w:t>"9.0.2"</w:t>
+      </w:r>
+      <w:r>
+        <w:rPr>
+          <w:rFonts w:ascii="Consolas" w:eastAsia="Times New Roman" w:hAnsi="Consolas" w:cs="Consolas"/>
+          <w:color w:val="BBBEBF"/>
+          <w:sz w:val="21"/>
+          <w:szCs w:val="21"/>
+          <w:lang w:val="en-US" w:eastAsia="pt-BR"/>
+        </w:rPr>
+        <w:t xml:space="preserve"> </w:t>
+      </w:r>
+      <w:r>
+        <w:rPr>
+          <w:rFonts w:ascii="Consolas" w:eastAsia="Times New Roman" w:hAnsi="Consolas" w:cs="Consolas"/>
+          <w:color w:val="808080"/>
+          <w:sz w:val="21"/>
+          <w:szCs w:val="21"/>
+          <w:lang w:val="en-US" w:eastAsia="pt-BR"/>
+        </w:rPr>
+        <w:t>/&gt;</w:t>
+      </w:r>
+    </w:p>
+    <w:p>
+      <w:pPr>
+        <w:shd w:val="clear" w:color="auto" w:fill="121314"/>
+        <w:spacing w:before="0" w:line="285" w:lineRule="atLeast"/>
+        <w:rPr>
+          <w:rFonts w:ascii="Consolas" w:eastAsia="Times New Roman" w:hAnsi="Consolas" w:cs="Consolas"/>
+          <w:color w:val="BBBEBF"/>
+          <w:sz w:val="21"/>
+          <w:szCs w:val="21"/>
+          <w:lang w:val="en-US" w:eastAsia="pt-BR"/>
+        </w:rPr>
+      </w:pPr>
+      <w:r>
+        <w:rPr>
+          <w:rFonts w:ascii="Consolas" w:eastAsia="Times New Roman" w:hAnsi="Consolas" w:cs="Consolas"/>
+          <w:color w:val="BBBEBF"/>
+          <w:sz w:val="21"/>
+          <w:szCs w:val="21"/>
+          <w:lang w:val="en-US" w:eastAsia="pt-BR"/>
+        </w:rPr>
+        <w:t xml:space="preserve">    </w:t>
+      </w:r>
+      <w:r>
+        <w:rPr>
+          <w:rFonts w:ascii="Consolas" w:eastAsia="Times New Roman" w:hAnsi="Consolas" w:cs="Consolas"/>
+          <w:color w:val="808080"/>
+          <w:sz w:val="21"/>
+          <w:szCs w:val="21"/>
+          <w:lang w:val="en-US" w:eastAsia="pt-BR"/>
+        </w:rPr>
+        <w:t>&lt;</w:t>
+      </w:r>
+      <w:proofErr w:type="spellStart"/>
+      <w:r>
+        <w:rPr>
+          <w:rFonts w:ascii="Consolas" w:eastAsia="Times New Roman" w:hAnsi="Consolas" w:cs="Consolas"/>
+          <w:color w:val="7EE787"/>
+          <w:sz w:val="21"/>
+          <w:szCs w:val="21"/>
+          <w:lang w:val="en-US" w:eastAsia="pt-BR"/>
+        </w:rPr>
+        <w:t>PackageReference</w:t>
+      </w:r>
+      <w:proofErr w:type="spellEnd"/>
+      <w:r>
+        <w:rPr>
+          <w:rFonts w:ascii="Consolas" w:eastAsia="Times New Roman" w:hAnsi="Consolas" w:cs="Consolas"/>
+          <w:color w:val="BBBEBF"/>
+          <w:sz w:val="21"/>
+          <w:szCs w:val="21"/>
+          <w:lang w:val="en-US" w:eastAsia="pt-BR"/>
+        </w:rPr>
+        <w:t xml:space="preserve"> </w:t>
+      </w:r>
+      <w:r>
+        <w:rPr>
+          <w:rFonts w:ascii="Consolas" w:eastAsia="Times New Roman" w:hAnsi="Consolas" w:cs="Consolas"/>
+          <w:color w:val="9CDCFE"/>
+          <w:sz w:val="21"/>
+          <w:szCs w:val="21"/>
+          <w:lang w:val="en-US" w:eastAsia="pt-BR"/>
+        </w:rPr>
+        <w:t>Include</w:t>
+      </w:r>
+      <w:r>
+        <w:rPr>
+          <w:rFonts w:ascii="Consolas" w:eastAsia="Times New Roman" w:hAnsi="Consolas" w:cs="Consolas"/>
+          <w:color w:val="BBBEBF"/>
+          <w:sz w:val="21"/>
+          <w:szCs w:val="21"/>
+          <w:lang w:val="en-US" w:eastAsia="pt-BR"/>
+        </w:rPr>
+        <w:t>=</w:t>
+      </w:r>
+      <w:r>
+        <w:rPr>
+          <w:rFonts w:ascii="Consolas" w:eastAsia="Times New Roman" w:hAnsi="Consolas" w:cs="Consolas"/>
+          <w:color w:val="A5D6FF"/>
+          <w:sz w:val="21"/>
+          <w:szCs w:val="21"/>
+          <w:lang w:val="en-US" w:eastAsia="pt-BR"/>
+        </w:rPr>
+        <w:t>"</w:t>
+      </w:r>
+      <w:proofErr w:type="spellStart"/>
+      <w:proofErr w:type="gramStart"/>
+      <w:r>
+        <w:rPr>
+          <w:rFonts w:ascii="Consolas" w:eastAsia="Times New Roman" w:hAnsi="Consolas" w:cs="Consolas"/>
+          <w:color w:val="A5D6FF"/>
+          <w:sz w:val="21"/>
+          <w:szCs w:val="21"/>
+          <w:lang w:val="en-US" w:eastAsia="pt-BR"/>
+        </w:rPr>
+        <w:t>Microsoft.EntityFrameworkCore.Design</w:t>
+      </w:r>
+      <w:proofErr w:type="spellEnd"/>
+      <w:proofErr w:type="gramEnd"/>
+      <w:r>
+        <w:rPr>
+          <w:rFonts w:ascii="Consolas" w:eastAsia="Times New Roman" w:hAnsi="Consolas" w:cs="Consolas"/>
+          <w:color w:val="A5D6FF"/>
+          <w:sz w:val="21"/>
+          <w:szCs w:val="21"/>
+          <w:lang w:val="en-US" w:eastAsia="pt-BR"/>
+        </w:rPr>
+        <w:t>"</w:t>
+      </w:r>
+      <w:r>
+        <w:rPr>
+          <w:rFonts w:ascii="Consolas" w:eastAsia="Times New Roman" w:hAnsi="Consolas" w:cs="Consolas"/>
+          <w:color w:val="BBBEBF"/>
+          <w:sz w:val="21"/>
+          <w:szCs w:val="21"/>
+          <w:lang w:val="en-US" w:eastAsia="pt-BR"/>
+        </w:rPr>
+        <w:t xml:space="preserve"> </w:t>
+      </w:r>
+      <w:r>
+        <w:rPr>
+          <w:rFonts w:ascii="Consolas" w:eastAsia="Times New Roman" w:hAnsi="Consolas" w:cs="Consolas"/>
+          <w:color w:val="9CDCFE"/>
+          <w:sz w:val="21"/>
+          <w:szCs w:val="21"/>
+          <w:lang w:val="en-US" w:eastAsia="pt-BR"/>
+        </w:rPr>
+        <w:t>Version</w:t>
+      </w:r>
+      <w:r>
+        <w:rPr>
+          <w:rFonts w:ascii="Consolas" w:eastAsia="Times New Roman" w:hAnsi="Consolas" w:cs="Consolas"/>
+          <w:color w:val="BBBEBF"/>
+          <w:sz w:val="21"/>
+          <w:szCs w:val="21"/>
+          <w:lang w:val="en-US" w:eastAsia="pt-BR"/>
+        </w:rPr>
+        <w:t>=</w:t>
+      </w:r>
+      <w:r>
+        <w:rPr>
+          <w:rFonts w:ascii="Consolas" w:eastAsia="Times New Roman" w:hAnsi="Consolas" w:cs="Consolas"/>
+          <w:color w:val="A5D6FF"/>
+          <w:sz w:val="21"/>
+          <w:szCs w:val="21"/>
+          <w:lang w:val="en-US" w:eastAsia="pt-BR"/>
+        </w:rPr>
+        <w:t>"9.0.2"</w:t>
+      </w:r>
+      <w:r>
+        <w:rPr>
+          <w:rFonts w:ascii="Consolas" w:eastAsia="Times New Roman" w:hAnsi="Consolas" w:cs="Consolas"/>
+          <w:color w:val="808080"/>
+          <w:sz w:val="21"/>
+          <w:szCs w:val="21"/>
+          <w:lang w:val="en-US" w:eastAsia="pt-BR"/>
+        </w:rPr>
+        <w:t>&gt;</w:t>
+      </w:r>
+    </w:p>
+    <w:p>
+      <w:pPr>
+        <w:shd w:val="clear" w:color="auto" w:fill="121314"/>
+        <w:spacing w:before="0" w:line="285" w:lineRule="atLeast"/>
+        <w:rPr>
+          <w:rFonts w:ascii="Consolas" w:eastAsia="Times New Roman" w:hAnsi="Consolas" w:cs="Consolas"/>
+          <w:color w:val="BBBEBF"/>
+          <w:sz w:val="21"/>
+          <w:szCs w:val="21"/>
+          <w:lang w:val="en-US" w:eastAsia="pt-BR"/>
+        </w:rPr>
+      </w:pPr>
+      <w:r>
+        <w:rPr>
+          <w:rFonts w:ascii="Consolas" w:eastAsia="Times New Roman" w:hAnsi="Consolas" w:cs="Consolas"/>
+          <w:color w:val="BBBEBF"/>
+          <w:sz w:val="21"/>
+          <w:szCs w:val="21"/>
+          <w:lang w:val="en-US" w:eastAsia="pt-BR"/>
+        </w:rPr>
+        <w:t xml:space="preserve">      </w:t>
+      </w:r>
+      <w:r>
+        <w:rPr>
+          <w:rFonts w:ascii="Consolas" w:eastAsia="Times New Roman" w:hAnsi="Consolas" w:cs="Consolas"/>
+          <w:color w:val="808080"/>
+          <w:sz w:val="21"/>
+          <w:szCs w:val="21"/>
+          <w:lang w:val="en-US" w:eastAsia="pt-BR"/>
+        </w:rPr>
+        <w:t>&lt;</w:t>
+      </w:r>
+      <w:proofErr w:type="spellStart"/>
+      <w:r>
+        <w:rPr>
+          <w:rFonts w:ascii="Consolas" w:eastAsia="Times New Roman" w:hAnsi="Consolas" w:cs="Consolas"/>
+          <w:color w:val="7EE787"/>
+          <w:sz w:val="21"/>
+          <w:szCs w:val="21"/>
+          <w:lang w:val="en-US" w:eastAsia="pt-BR"/>
+        </w:rPr>
+        <w:t>IncludeAssets</w:t>
+      </w:r>
+      <w:proofErr w:type="spellEnd"/>
+      <w:r>
+        <w:rPr>
+          <w:rFonts w:ascii="Consolas" w:eastAsia="Times New Roman" w:hAnsi="Consolas" w:cs="Consolas"/>
+          <w:color w:val="808080"/>
+          <w:sz w:val="21"/>
+          <w:szCs w:val="21"/>
+          <w:lang w:val="en-US" w:eastAsia="pt-BR"/>
+        </w:rPr>
+        <w:t>&gt;</w:t>
+      </w:r>
+      <w:r>
+        <w:rPr>
+          <w:rFonts w:ascii="Consolas" w:eastAsia="Times New Roman" w:hAnsi="Consolas" w:cs="Consolas"/>
+          <w:color w:val="BBBEBF"/>
+          <w:sz w:val="21"/>
+          <w:szCs w:val="21"/>
+          <w:lang w:val="en-US" w:eastAsia="pt-BR"/>
+        </w:rPr>
+        <w:t xml:space="preserve">runtime; build; native; </w:t>
+      </w:r>
+      <w:proofErr w:type="spellStart"/>
+      <w:r>
+        <w:rPr>
+          <w:rFonts w:ascii="Consolas" w:eastAsia="Times New Roman" w:hAnsi="Consolas" w:cs="Consolas"/>
+          <w:color w:val="BBBEBF"/>
+          <w:sz w:val="21"/>
+          <w:szCs w:val="21"/>
+          <w:lang w:val="en-US" w:eastAsia="pt-BR"/>
+        </w:rPr>
+        <w:t>contentfiles</w:t>
+      </w:r>
+      <w:proofErr w:type="spellEnd"/>
+      <w:r>
+        <w:rPr>
+          <w:rFonts w:ascii="Consolas" w:eastAsia="Times New Roman" w:hAnsi="Consolas" w:cs="Consolas"/>
+          <w:color w:val="BBBEBF"/>
+          <w:sz w:val="21"/>
+          <w:szCs w:val="21"/>
+          <w:lang w:val="en-US" w:eastAsia="pt-BR"/>
+        </w:rPr>
+        <w:t xml:space="preserve">; analyzers; </w:t>
+      </w:r>
+      <w:proofErr w:type="spellStart"/>
+      <w:r>
+        <w:rPr>
+          <w:rFonts w:ascii="Consolas" w:eastAsia="Times New Roman" w:hAnsi="Consolas" w:cs="Consolas"/>
+          <w:color w:val="BBBEBF"/>
+          <w:sz w:val="21"/>
+          <w:szCs w:val="21"/>
+          <w:lang w:val="en-US" w:eastAsia="pt-BR"/>
+        </w:rPr>
+        <w:t>buildtransitive</w:t>
+      </w:r>
+      <w:proofErr w:type="spellEnd"/>
+      <w:r>
+        <w:rPr>
+          <w:rFonts w:ascii="Consolas" w:eastAsia="Times New Roman" w:hAnsi="Consolas" w:cs="Consolas"/>
+          <w:color w:val="808080"/>
+          <w:sz w:val="21"/>
+          <w:szCs w:val="21"/>
+          <w:lang w:val="en-US" w:eastAsia="pt-BR"/>
+        </w:rPr>
+        <w:t>&lt;/</w:t>
+      </w:r>
+      <w:proofErr w:type="spellStart"/>
+      <w:r>
+        <w:rPr>
+          <w:rFonts w:ascii="Consolas" w:eastAsia="Times New Roman" w:hAnsi="Consolas" w:cs="Consolas"/>
+          <w:color w:val="7EE787"/>
+          <w:sz w:val="21"/>
+          <w:szCs w:val="21"/>
+          <w:lang w:val="en-US" w:eastAsia="pt-BR"/>
+        </w:rPr>
+        <w:t>IncludeAssets</w:t>
+      </w:r>
+      <w:proofErr w:type="spellEnd"/>
+      <w:r>
+        <w:rPr>
+          <w:rFonts w:ascii="Consolas" w:eastAsia="Times New Roman" w:hAnsi="Consolas" w:cs="Consolas"/>
+          <w:color w:val="808080"/>
+          <w:sz w:val="21"/>
+          <w:szCs w:val="21"/>
+          <w:lang w:val="en-US" w:eastAsia="pt-BR"/>
+        </w:rPr>
+        <w:t>&gt;</w:t>
+      </w:r>
+    </w:p>
+    <w:p>
+      <w:pPr>
+        <w:shd w:val="clear" w:color="auto" w:fill="121314"/>
+        <w:spacing w:before="0" w:line="285" w:lineRule="atLeast"/>
+        <w:rPr>
+          <w:rFonts w:ascii="Consolas" w:eastAsia="Times New Roman" w:hAnsi="Consolas" w:cs="Consolas"/>
+          <w:color w:val="BBBEBF"/>
+          <w:sz w:val="21"/>
+          <w:szCs w:val="21"/>
+          <w:lang w:val="en-US" w:eastAsia="pt-BR"/>
+        </w:rPr>
+      </w:pPr>
+      <w:r>
+        <w:rPr>
+          <w:rFonts w:ascii="Consolas" w:eastAsia="Times New Roman" w:hAnsi="Consolas" w:cs="Consolas"/>
+          <w:color w:val="BBBEBF"/>
+          <w:sz w:val="21"/>
+          <w:szCs w:val="21"/>
+          <w:lang w:val="en-US" w:eastAsia="pt-BR"/>
+        </w:rPr>
+        <w:t xml:space="preserve">      </w:t>
+      </w:r>
+      <w:r>
+        <w:rPr>
+          <w:rFonts w:ascii="Consolas" w:eastAsia="Times New Roman" w:hAnsi="Consolas" w:cs="Consolas"/>
+          <w:color w:val="808080"/>
+          <w:sz w:val="21"/>
+          <w:szCs w:val="21"/>
+          <w:lang w:val="en-US" w:eastAsia="pt-BR"/>
+        </w:rPr>
+        <w:t>&lt;</w:t>
+      </w:r>
+      <w:proofErr w:type="spellStart"/>
+      <w:r>
+        <w:rPr>
+          <w:rFonts w:ascii="Consolas" w:eastAsia="Times New Roman" w:hAnsi="Consolas" w:cs="Consolas"/>
+          <w:color w:val="7EE787"/>
+          <w:sz w:val="21"/>
+          <w:szCs w:val="21"/>
+          <w:lang w:val="en-US" w:eastAsia="pt-BR"/>
+        </w:rPr>
+        <w:t>PrivateAssets</w:t>
+      </w:r>
+      <w:proofErr w:type="spellEnd"/>
+      <w:r>
+        <w:rPr>
+          <w:rFonts w:ascii="Consolas" w:eastAsia="Times New Roman" w:hAnsi="Consolas" w:cs="Consolas"/>
+          <w:color w:val="808080"/>
+          <w:sz w:val="21"/>
+          <w:szCs w:val="21"/>
+          <w:lang w:val="en-US" w:eastAsia="pt-BR"/>
+        </w:rPr>
+        <w:t>&gt;</w:t>
+      </w:r>
+      <w:r>
+        <w:rPr>
+          <w:rFonts w:ascii="Consolas" w:eastAsia="Times New Roman" w:hAnsi="Consolas" w:cs="Consolas"/>
+          <w:color w:val="BBBEBF"/>
+          <w:sz w:val="21"/>
+          <w:szCs w:val="21"/>
+          <w:lang w:val="en-US" w:eastAsia="pt-BR"/>
+        </w:rPr>
+        <w:t>all</w:t>
+      </w:r>
+      <w:r>
+        <w:rPr>
+          <w:rFonts w:ascii="Consolas" w:eastAsia="Times New Roman" w:hAnsi="Consolas" w:cs="Consolas"/>
+          <w:color w:val="808080"/>
+          <w:sz w:val="21"/>
+          <w:szCs w:val="21"/>
+          <w:lang w:val="en-US" w:eastAsia="pt-BR"/>
+        </w:rPr>
+        <w:t>&lt;/</w:t>
+      </w:r>
+      <w:proofErr w:type="spellStart"/>
+      <w:r>
+        <w:rPr>
+          <w:rFonts w:ascii="Consolas" w:eastAsia="Times New Roman" w:hAnsi="Consolas" w:cs="Consolas"/>
+          <w:color w:val="7EE787"/>
+          <w:sz w:val="21"/>
+          <w:szCs w:val="21"/>
+          <w:lang w:val="en-US" w:eastAsia="pt-BR"/>
+        </w:rPr>
+        <w:t>PrivateAssets</w:t>
+      </w:r>
+      <w:proofErr w:type="spellEnd"/>
+      <w:r>
+        <w:rPr>
+          <w:rFonts w:ascii="Consolas" w:eastAsia="Times New Roman" w:hAnsi="Consolas" w:cs="Consolas"/>
+          <w:color w:val="808080"/>
+          <w:sz w:val="21"/>
+          <w:szCs w:val="21"/>
+          <w:lang w:val="en-US" w:eastAsia="pt-BR"/>
+        </w:rPr>
+        <w:t>&gt;</w:t>
+      </w:r>
+    </w:p>
+    <w:p>
+      <w:pPr>
+        <w:shd w:val="clear" w:color="auto" w:fill="121314"/>
+        <w:spacing w:before="0" w:line="285" w:lineRule="atLeast"/>
+        <w:rPr>
+          <w:rFonts w:ascii="Consolas" w:eastAsia="Times New Roman" w:hAnsi="Consolas" w:cs="Consolas"/>
+          <w:color w:val="BBBEBF"/>
+          <w:sz w:val="21"/>
+          <w:szCs w:val="21"/>
+          <w:lang w:val="en-US" w:eastAsia="pt-BR"/>
+        </w:rPr>
+      </w:pPr>
+      <w:r>
+        <w:rPr>
+          <w:rFonts w:ascii="Consolas" w:eastAsia="Times New Roman" w:hAnsi="Consolas" w:cs="Consolas"/>
+          <w:color w:val="BBBEBF"/>
+          <w:sz w:val="21"/>
+          <w:szCs w:val="21"/>
+          <w:lang w:val="en-US" w:eastAsia="pt-BR"/>
+        </w:rPr>
+        <w:t xml:space="preserve">    </w:t>
+      </w:r>
+      <w:r>
+        <w:rPr>
+          <w:rFonts w:ascii="Consolas" w:eastAsia="Times New Roman" w:hAnsi="Consolas" w:cs="Consolas"/>
+          <w:color w:val="808080"/>
+          <w:sz w:val="21"/>
+          <w:szCs w:val="21"/>
+          <w:lang w:val="en-US" w:eastAsia="pt-BR"/>
+        </w:rPr>
+        <w:t>&lt;/</w:t>
+      </w:r>
+      <w:proofErr w:type="spellStart"/>
+      <w:r>
+        <w:rPr>
+          <w:rFonts w:ascii="Consolas" w:eastAsia="Times New Roman" w:hAnsi="Consolas" w:cs="Consolas"/>
+          <w:color w:val="7EE787"/>
+          <w:sz w:val="21"/>
+          <w:szCs w:val="21"/>
+          <w:lang w:val="en-US" w:eastAsia="pt-BR"/>
+        </w:rPr>
+        <w:t>PackageReference</w:t>
+      </w:r>
+      <w:proofErr w:type="spellEnd"/>
+      <w:r>
+        <w:rPr>
+          <w:rFonts w:ascii="Consolas" w:eastAsia="Times New Roman" w:hAnsi="Consolas" w:cs="Consolas"/>
+          <w:color w:val="808080"/>
+          <w:sz w:val="21"/>
+          <w:szCs w:val="21"/>
+          <w:lang w:val="en-US" w:eastAsia="pt-BR"/>
+        </w:rPr>
+        <w:t>&gt;</w:t>
+      </w:r>
+    </w:p>
+    <w:p>
+      <w:pPr>
+        <w:shd w:val="clear" w:color="auto" w:fill="121314"/>
+        <w:spacing w:before="0" w:line="285" w:lineRule="atLeast"/>
+        <w:rPr>
+          <w:rFonts w:ascii="Consolas" w:eastAsia="Times New Roman" w:hAnsi="Consolas" w:cs="Consolas"/>
+          <w:color w:val="BBBEBF"/>
+          <w:sz w:val="21"/>
+          <w:szCs w:val="21"/>
+          <w:lang w:val="en-US" w:eastAsia="pt-BR"/>
+        </w:rPr>
+      </w:pPr>
+      <w:r>
+        <w:rPr>
+          <w:rFonts w:ascii="Consolas" w:eastAsia="Times New Roman" w:hAnsi="Consolas" w:cs="Consolas"/>
+          <w:color w:val="BBBEBF"/>
+          <w:sz w:val="21"/>
+          <w:szCs w:val="21"/>
+          <w:lang w:val="en-US" w:eastAsia="pt-BR"/>
+        </w:rPr>
+        <w:t xml:space="preserve">    </w:t>
+      </w:r>
+      <w:r>
+        <w:rPr>
+          <w:rFonts w:ascii="Consolas" w:eastAsia="Times New Roman" w:hAnsi="Consolas" w:cs="Consolas"/>
+          <w:color w:val="808080"/>
+          <w:sz w:val="21"/>
+          <w:szCs w:val="21"/>
+          <w:lang w:val="en-US" w:eastAsia="pt-BR"/>
+        </w:rPr>
+        <w:t>&lt;</w:t>
+      </w:r>
+      <w:proofErr w:type="spellStart"/>
+      <w:r>
+        <w:rPr>
+          <w:rFonts w:ascii="Consolas" w:eastAsia="Times New Roman" w:hAnsi="Consolas" w:cs="Consolas"/>
+          <w:color w:val="7EE787"/>
+          <w:sz w:val="21"/>
+          <w:szCs w:val="21"/>
+          <w:lang w:val="en-US" w:eastAsia="pt-BR"/>
+        </w:rPr>
+        <w:t>PackageReference</w:t>
+      </w:r>
+      <w:proofErr w:type="spellEnd"/>
+      <w:r>
+        <w:rPr>
+          <w:rFonts w:ascii="Consolas" w:eastAsia="Times New Roman" w:hAnsi="Consolas" w:cs="Consolas"/>
+          <w:color w:val="BBBEBF"/>
+          <w:sz w:val="21"/>
+          <w:szCs w:val="21"/>
+          <w:lang w:val="en-US" w:eastAsia="pt-BR"/>
+        </w:rPr>
+        <w:t xml:space="preserve"> </w:t>
+      </w:r>
+      <w:r>
+        <w:rPr>
+          <w:rFonts w:ascii="Consolas" w:eastAsia="Times New Roman" w:hAnsi="Consolas" w:cs="Consolas"/>
+          <w:color w:val="9CDCFE"/>
+          <w:sz w:val="21"/>
+          <w:szCs w:val="21"/>
+          <w:lang w:val="en-US" w:eastAsia="pt-BR"/>
+        </w:rPr>
+        <w:t>Include</w:t>
+      </w:r>
+      <w:r>
+        <w:rPr>
+          <w:rFonts w:ascii="Consolas" w:eastAsia="Times New Roman" w:hAnsi="Consolas" w:cs="Consolas"/>
+          <w:color w:val="BBBEBF"/>
+          <w:sz w:val="21"/>
+          <w:szCs w:val="21"/>
+          <w:lang w:val="en-US" w:eastAsia="pt-BR"/>
+        </w:rPr>
+        <w:t>=</w:t>
+      </w:r>
+      <w:r>
+        <w:rPr>
+          <w:rFonts w:ascii="Consolas" w:eastAsia="Times New Roman" w:hAnsi="Consolas" w:cs="Consolas"/>
+          <w:color w:val="A5D6FF"/>
+          <w:sz w:val="21"/>
+          <w:szCs w:val="21"/>
+          <w:lang w:val="en-US" w:eastAsia="pt-BR"/>
+        </w:rPr>
+        <w:t>"</w:t>
+      </w:r>
+      <w:proofErr w:type="spellStart"/>
+      <w:proofErr w:type="gramStart"/>
+      <w:r>
+        <w:rPr>
+          <w:rFonts w:ascii="Consolas" w:eastAsia="Times New Roman" w:hAnsi="Consolas" w:cs="Consolas"/>
+          <w:color w:val="A5D6FF"/>
+          <w:sz w:val="21"/>
+          <w:szCs w:val="21"/>
+          <w:lang w:val="en-US" w:eastAsia="pt-BR"/>
+        </w:rPr>
+        <w:t>Microsoft.EntityFrameworkCore.Relational</w:t>
+      </w:r>
+      <w:proofErr w:type="spellEnd"/>
+      <w:proofErr w:type="gramEnd"/>
+      <w:r>
+        <w:rPr>
+          <w:rFonts w:ascii="Consolas" w:eastAsia="Times New Roman" w:hAnsi="Consolas" w:cs="Consolas"/>
+          <w:color w:val="A5D6FF"/>
+          <w:sz w:val="21"/>
+          <w:szCs w:val="21"/>
+          <w:lang w:val="en-US" w:eastAsia="pt-BR"/>
+        </w:rPr>
+        <w:t>"</w:t>
+      </w:r>
+      <w:r>
+        <w:rPr>
+          <w:rFonts w:ascii="Consolas" w:eastAsia="Times New Roman" w:hAnsi="Consolas" w:cs="Consolas"/>
+          <w:color w:val="BBBEBF"/>
+          <w:sz w:val="21"/>
+          <w:szCs w:val="21"/>
+          <w:lang w:val="en-US" w:eastAsia="pt-BR"/>
+        </w:rPr>
+        <w:t xml:space="preserve"> </w:t>
+      </w:r>
+      <w:r>
+        <w:rPr>
+          <w:rFonts w:ascii="Consolas" w:eastAsia="Times New Roman" w:hAnsi="Consolas" w:cs="Consolas"/>
+          <w:color w:val="9CDCFE"/>
+          <w:sz w:val="21"/>
+          <w:szCs w:val="21"/>
+          <w:lang w:val="en-US" w:eastAsia="pt-BR"/>
+        </w:rPr>
+        <w:t>Version</w:t>
+      </w:r>
+      <w:r>
+        <w:rPr>
+          <w:rFonts w:ascii="Consolas" w:eastAsia="Times New Roman" w:hAnsi="Consolas" w:cs="Consolas"/>
+          <w:color w:val="BBBEBF"/>
+          <w:sz w:val="21"/>
+          <w:szCs w:val="21"/>
+          <w:lang w:val="en-US" w:eastAsia="pt-BR"/>
+        </w:rPr>
+        <w:t>=</w:t>
+      </w:r>
+      <w:r>
+        <w:rPr>
+          <w:rFonts w:ascii="Consolas" w:eastAsia="Times New Roman" w:hAnsi="Consolas" w:cs="Consolas"/>
+          <w:color w:val="A5D6FF"/>
+          <w:sz w:val="21"/>
+          <w:szCs w:val="21"/>
+          <w:lang w:val="en-US" w:eastAsia="pt-BR"/>
+        </w:rPr>
+        <w:t>"9.0.2"</w:t>
+      </w:r>
+      <w:r>
+        <w:rPr>
+          <w:rFonts w:ascii="Consolas" w:eastAsia="Times New Roman" w:hAnsi="Consolas" w:cs="Consolas"/>
+          <w:color w:val="BBBEBF"/>
+          <w:sz w:val="21"/>
+          <w:szCs w:val="21"/>
+          <w:lang w:val="en-US" w:eastAsia="pt-BR"/>
+        </w:rPr>
+        <w:t xml:space="preserve"> </w:t>
+      </w:r>
+      <w:r>
+        <w:rPr>
+          <w:rFonts w:ascii="Consolas" w:eastAsia="Times New Roman" w:hAnsi="Consolas" w:cs="Consolas"/>
+          <w:color w:val="808080"/>
+          <w:sz w:val="21"/>
+          <w:szCs w:val="21"/>
+          <w:lang w:val="en-US" w:eastAsia="pt-BR"/>
+        </w:rPr>
+        <w:t>/&gt;</w:t>
+      </w:r>
+    </w:p>
+    <w:p>
+      <w:pPr>
+        <w:shd w:val="clear" w:color="auto" w:fill="121314"/>
+        <w:spacing w:before="0" w:line="285" w:lineRule="atLeast"/>
+        <w:rPr>
+          <w:rFonts w:ascii="Consolas" w:eastAsia="Times New Roman" w:hAnsi="Consolas" w:cs="Consolas"/>
+          <w:color w:val="BBBEBF"/>
+          <w:sz w:val="21"/>
+          <w:szCs w:val="21"/>
+          <w:lang w:val="pt-BR" w:eastAsia="pt-BR"/>
+        </w:rPr>
+      </w:pPr>
+      <w:r>
+        <w:rPr>
+          <w:rFonts w:ascii="Consolas" w:eastAsia="Times New Roman" w:hAnsi="Consolas" w:cs="Consolas"/>
+          <w:color w:val="BBBEBF"/>
+          <w:sz w:val="21"/>
+          <w:szCs w:val="21"/>
+          <w:lang w:val="en-US" w:eastAsia="pt-BR"/>
+        </w:rPr>
+        <w:t xml:space="preserve">    </w:t>
+      </w:r>
+      <w:proofErr w:type="gramStart"/>
+      <w:r>
+        <w:rPr>
+          <w:rFonts w:ascii="Consolas" w:eastAsia="Times New Roman" w:hAnsi="Consolas" w:cs="Consolas"/>
+          <w:color w:val="8B949E"/>
+          <w:sz w:val="21"/>
+          <w:szCs w:val="21"/>
+          <w:lang w:val="pt-BR" w:eastAsia="pt-BR"/>
+        </w:rPr>
+        <w:t>&lt;!--</w:t>
+      </w:r>
+      <w:proofErr w:type="gramEnd"/>
+      <w:r>
+        <w:rPr>
+          <w:rFonts w:ascii="Consolas" w:eastAsia="Times New Roman" w:hAnsi="Consolas" w:cs="Consolas"/>
+          <w:color w:val="8B949E"/>
+          <w:sz w:val="21"/>
+          <w:szCs w:val="21"/>
+          <w:lang w:val="pt-BR" w:eastAsia="pt-BR"/>
+        </w:rPr>
+        <w:t xml:space="preserve"> Alterado de 10.0.8 para 9.0.2 --&gt;</w:t>
+      </w:r>
+    </w:p>
+    <w:p>
+      <w:pPr>
+        <w:shd w:val="clear" w:color="auto" w:fill="121314"/>
+        <w:spacing w:before="0" w:line="285" w:lineRule="atLeast"/>
+        <w:rPr>
+          <w:rFonts w:ascii="Consolas" w:eastAsia="Times New Roman" w:hAnsi="Consolas" w:cs="Consolas"/>
+          <w:color w:val="BBBEBF"/>
+          <w:sz w:val="21"/>
+          <w:szCs w:val="21"/>
+          <w:lang w:val="pt-BR" w:eastAsia="pt-BR"/>
+        </w:rPr>
+      </w:pPr>
+      <w:r>
+        <w:rPr>
+          <w:rFonts w:ascii="Consolas" w:eastAsia="Times New Roman" w:hAnsi="Consolas" w:cs="Consolas"/>
+          <w:color w:val="BBBEBF"/>
+          <w:sz w:val="21"/>
+          <w:szCs w:val="21"/>
+          <w:lang w:val="pt-BR" w:eastAsia="pt-BR"/>
+        </w:rPr>
+        <w:t xml:space="preserve">    </w:t>
+      </w:r>
+      <w:r>
+        <w:rPr>
+          <w:rFonts w:ascii="Consolas" w:eastAsia="Times New Roman" w:hAnsi="Consolas" w:cs="Consolas"/>
+          <w:color w:val="808080"/>
+          <w:sz w:val="21"/>
+          <w:szCs w:val="21"/>
+          <w:lang w:val="pt-BR" w:eastAsia="pt-BR"/>
+        </w:rPr>
+        <w:t>&lt;</w:t>
+      </w:r>
+      <w:proofErr w:type="spellStart"/>
+      <w:r>
+        <w:rPr>
+          <w:rFonts w:ascii="Consolas" w:eastAsia="Times New Roman" w:hAnsi="Consolas" w:cs="Consolas"/>
+          <w:color w:val="7EE787"/>
+          <w:sz w:val="21"/>
+          <w:szCs w:val="21"/>
+          <w:lang w:val="pt-BR" w:eastAsia="pt-BR"/>
+        </w:rPr>
+        <w:t>PackageReference</w:t>
+      </w:r>
+      <w:proofErr w:type="spellEnd"/>
+      <w:r>
+        <w:rPr>
+          <w:rFonts w:ascii="Consolas" w:eastAsia="Times New Roman" w:hAnsi="Consolas" w:cs="Consolas"/>
+          <w:color w:val="BBBEBF"/>
+          <w:sz w:val="21"/>
+          <w:szCs w:val="21"/>
+          <w:lang w:val="pt-BR" w:eastAsia="pt-BR"/>
+        </w:rPr>
+        <w:t xml:space="preserve"> </w:t>
+      </w:r>
+      <w:r>
+        <w:rPr>
+          <w:rFonts w:ascii="Consolas" w:eastAsia="Times New Roman" w:hAnsi="Consolas" w:cs="Consolas"/>
+          <w:color w:val="9CDCFE"/>
+          <w:sz w:val="21"/>
+          <w:szCs w:val="21"/>
+          <w:lang w:val="pt-BR" w:eastAsia="pt-BR"/>
+        </w:rPr>
+        <w:t>Include</w:t>
+      </w:r>
+      <w:r>
+        <w:rPr>
+          <w:rFonts w:ascii="Consolas" w:eastAsia="Times New Roman" w:hAnsi="Consolas" w:cs="Consolas"/>
+          <w:color w:val="BBBEBF"/>
+          <w:sz w:val="21"/>
+          <w:szCs w:val="21"/>
+          <w:lang w:val="pt-BR" w:eastAsia="pt-BR"/>
+        </w:rPr>
+        <w:t>=</w:t>
+      </w:r>
+      <w:r>
+        <w:rPr>
+          <w:rFonts w:ascii="Consolas" w:eastAsia="Times New Roman" w:hAnsi="Consolas" w:cs="Consolas"/>
+          <w:color w:val="A5D6FF"/>
+          <w:sz w:val="21"/>
+          <w:szCs w:val="21"/>
+          <w:lang w:val="pt-BR" w:eastAsia="pt-BR"/>
+        </w:rPr>
+        <w:t>"</w:t>
+      </w:r>
+      <w:proofErr w:type="spellStart"/>
+      <w:proofErr w:type="gramStart"/>
+      <w:r>
+        <w:rPr>
+          <w:rFonts w:ascii="Consolas" w:eastAsia="Times New Roman" w:hAnsi="Consolas" w:cs="Consolas"/>
+          <w:color w:val="A5D6FF"/>
+          <w:sz w:val="21"/>
+          <w:szCs w:val="21"/>
+          <w:lang w:val="pt-BR" w:eastAsia="pt-BR"/>
+        </w:rPr>
+        <w:t>Microsoft.EntityFrameworkCore.SqlServer</w:t>
+      </w:r>
+      <w:proofErr w:type="spellEnd"/>
+      <w:proofErr w:type="gramEnd"/>
+      <w:r>
+        <w:rPr>
+          <w:rFonts w:ascii="Consolas" w:eastAsia="Times New Roman" w:hAnsi="Consolas" w:cs="Consolas"/>
+          <w:color w:val="A5D6FF"/>
+          <w:sz w:val="21"/>
+          <w:szCs w:val="21"/>
+          <w:lang w:val="pt-BR" w:eastAsia="pt-BR"/>
+        </w:rPr>
+        <w:t>"</w:t>
+      </w:r>
+      <w:r>
+        <w:rPr>
+          <w:rFonts w:ascii="Consolas" w:eastAsia="Times New Roman" w:hAnsi="Consolas" w:cs="Consolas"/>
+          <w:color w:val="BBBEBF"/>
+          <w:sz w:val="21"/>
+          <w:szCs w:val="21"/>
+          <w:lang w:val="pt-BR" w:eastAsia="pt-BR"/>
+        </w:rPr>
+        <w:t xml:space="preserve"> </w:t>
+      </w:r>
+      <w:proofErr w:type="spellStart"/>
+      <w:r>
+        <w:rPr>
+          <w:rFonts w:ascii="Consolas" w:eastAsia="Times New Roman" w:hAnsi="Consolas" w:cs="Consolas"/>
+          <w:color w:val="9CDCFE"/>
+          <w:sz w:val="21"/>
+          <w:szCs w:val="21"/>
+          <w:lang w:val="pt-BR" w:eastAsia="pt-BR"/>
+        </w:rPr>
+        <w:t>Version</w:t>
+      </w:r>
+      <w:proofErr w:type="spellEnd"/>
+      <w:r>
+        <w:rPr>
+          <w:rFonts w:ascii="Consolas" w:eastAsia="Times New Roman" w:hAnsi="Consolas" w:cs="Consolas"/>
+          <w:color w:val="BBBEBF"/>
+          <w:sz w:val="21"/>
+          <w:szCs w:val="21"/>
+          <w:lang w:val="pt-BR" w:eastAsia="pt-BR"/>
+        </w:rPr>
+        <w:t>=</w:t>
+      </w:r>
+      <w:r>
+        <w:rPr>
+          <w:rFonts w:ascii="Consolas" w:eastAsia="Times New Roman" w:hAnsi="Consolas" w:cs="Consolas"/>
+          <w:color w:val="A5D6FF"/>
+          <w:sz w:val="21"/>
+          <w:szCs w:val="21"/>
+          <w:lang w:val="pt-BR" w:eastAsia="pt-BR"/>
+        </w:rPr>
+        <w:t>"9.0.2"</w:t>
+      </w:r>
+      <w:r>
+        <w:rPr>
+          <w:rFonts w:ascii="Consolas" w:eastAsia="Times New Roman" w:hAnsi="Consolas" w:cs="Consolas"/>
+          <w:color w:val="BBBEBF"/>
+          <w:sz w:val="21"/>
+          <w:szCs w:val="21"/>
+          <w:lang w:val="pt-BR" w:eastAsia="pt-BR"/>
+        </w:rPr>
+        <w:t xml:space="preserve"> </w:t>
+      </w:r>
+      <w:r>
+        <w:rPr>
+          <w:rFonts w:ascii="Consolas" w:eastAsia="Times New Roman" w:hAnsi="Consolas" w:cs="Consolas"/>
+          <w:color w:val="808080"/>
+          <w:sz w:val="21"/>
+          <w:szCs w:val="21"/>
+          <w:lang w:val="pt-BR" w:eastAsia="pt-BR"/>
+        </w:rPr>
+        <w:t>/&gt;</w:t>
+      </w:r>
+    </w:p>
+    <w:p>
+      <w:pPr>
+        <w:shd w:val="clear" w:color="auto" w:fill="121314"/>
+        <w:spacing w:before="0" w:line="285" w:lineRule="atLeast"/>
+        <w:rPr>
+          <w:rFonts w:ascii="Consolas" w:eastAsia="Times New Roman" w:hAnsi="Consolas" w:cs="Consolas"/>
+          <w:color w:val="BBBEBF"/>
+          <w:sz w:val="21"/>
+          <w:szCs w:val="21"/>
+          <w:lang w:val="en-US" w:eastAsia="pt-BR"/>
+        </w:rPr>
+      </w:pPr>
+      <w:r>
+        <w:rPr>
+          <w:rFonts w:ascii="Consolas" w:eastAsia="Times New Roman" w:hAnsi="Consolas" w:cs="Consolas"/>
+          <w:color w:val="BBBEBF"/>
+          <w:sz w:val="21"/>
+          <w:szCs w:val="21"/>
+          <w:lang w:val="pt-BR" w:eastAsia="pt-BR"/>
+        </w:rPr>
+        <w:t xml:space="preserve">    </w:t>
+      </w:r>
+      <w:r>
+        <w:rPr>
+          <w:rFonts w:ascii="Consolas" w:eastAsia="Times New Roman" w:hAnsi="Consolas" w:cs="Consolas"/>
+          <w:color w:val="808080"/>
+          <w:sz w:val="21"/>
+          <w:szCs w:val="21"/>
+          <w:lang w:val="en-US" w:eastAsia="pt-BR"/>
+        </w:rPr>
+        <w:t>&lt;</w:t>
+      </w:r>
+      <w:proofErr w:type="spellStart"/>
+      <w:r>
+        <w:rPr>
+          <w:rFonts w:ascii="Consolas" w:eastAsia="Times New Roman" w:hAnsi="Consolas" w:cs="Consolas"/>
+          <w:color w:val="7EE787"/>
+          <w:sz w:val="21"/>
+          <w:szCs w:val="21"/>
+          <w:lang w:val="en-US" w:eastAsia="pt-BR"/>
+        </w:rPr>
+        <w:t>PackageReference</w:t>
+      </w:r>
+      <w:proofErr w:type="spellEnd"/>
+      <w:r>
+        <w:rPr>
+          <w:rFonts w:ascii="Consolas" w:eastAsia="Times New Roman" w:hAnsi="Consolas" w:cs="Consolas"/>
+          <w:color w:val="BBBEBF"/>
+          <w:sz w:val="21"/>
+          <w:szCs w:val="21"/>
+          <w:lang w:val="en-US" w:eastAsia="pt-BR"/>
+        </w:rPr>
+        <w:t xml:space="preserve"> </w:t>
+      </w:r>
+      <w:r>
+        <w:rPr>
+          <w:rFonts w:ascii="Consolas" w:eastAsia="Times New Roman" w:hAnsi="Consolas" w:cs="Consolas"/>
+          <w:color w:val="9CDCFE"/>
+          <w:sz w:val="21"/>
+          <w:szCs w:val="21"/>
+          <w:lang w:val="en-US" w:eastAsia="pt-BR"/>
+        </w:rPr>
+        <w:t>Include</w:t>
+      </w:r>
+      <w:r>
+        <w:rPr>
+          <w:rFonts w:ascii="Consolas" w:eastAsia="Times New Roman" w:hAnsi="Consolas" w:cs="Consolas"/>
+          <w:color w:val="BBBEBF"/>
+          <w:sz w:val="21"/>
+          <w:szCs w:val="21"/>
+          <w:lang w:val="en-US" w:eastAsia="pt-BR"/>
+        </w:rPr>
+        <w:t>=</w:t>
+      </w:r>
+      <w:r>
+        <w:rPr>
+          <w:rFonts w:ascii="Consolas" w:eastAsia="Times New Roman" w:hAnsi="Consolas" w:cs="Consolas"/>
+          <w:color w:val="A5D6FF"/>
+          <w:sz w:val="21"/>
+          <w:szCs w:val="21"/>
+          <w:lang w:val="en-US" w:eastAsia="pt-BR"/>
+        </w:rPr>
+        <w:t>"</w:t>
+      </w:r>
+      <w:proofErr w:type="spellStart"/>
+      <w:proofErr w:type="gramStart"/>
+      <w:r>
+        <w:rPr>
+          <w:rFonts w:ascii="Consolas" w:eastAsia="Times New Roman" w:hAnsi="Consolas" w:cs="Consolas"/>
+          <w:color w:val="A5D6FF"/>
+          <w:sz w:val="21"/>
+          <w:szCs w:val="21"/>
+          <w:lang w:val="en-US" w:eastAsia="pt-BR"/>
+        </w:rPr>
+        <w:t>Microsoft.EntityFrameworkCore.Tools</w:t>
+      </w:r>
+      <w:proofErr w:type="spellEnd"/>
+      <w:proofErr w:type="gramEnd"/>
+      <w:r>
+        <w:rPr>
+          <w:rFonts w:ascii="Consolas" w:eastAsia="Times New Roman" w:hAnsi="Consolas" w:cs="Consolas"/>
+          <w:color w:val="A5D6FF"/>
+          <w:sz w:val="21"/>
+          <w:szCs w:val="21"/>
+          <w:lang w:val="en-US" w:eastAsia="pt-BR"/>
+        </w:rPr>
+        <w:t>"</w:t>
+      </w:r>
+      <w:r>
+        <w:rPr>
+          <w:rFonts w:ascii="Consolas" w:eastAsia="Times New Roman" w:hAnsi="Consolas" w:cs="Consolas"/>
+          <w:color w:val="BBBEBF"/>
+          <w:sz w:val="21"/>
+          <w:szCs w:val="21"/>
+          <w:lang w:val="en-US" w:eastAsia="pt-BR"/>
+        </w:rPr>
+        <w:t xml:space="preserve"> </w:t>
+      </w:r>
+      <w:r>
+        <w:rPr>
+          <w:rFonts w:ascii="Consolas" w:eastAsia="Times New Roman" w:hAnsi="Consolas" w:cs="Consolas"/>
+          <w:color w:val="9CDCFE"/>
+          <w:sz w:val="21"/>
+          <w:szCs w:val="21"/>
+          <w:lang w:val="en-US" w:eastAsia="pt-BR"/>
+        </w:rPr>
+        <w:t>Version</w:t>
+      </w:r>
+      <w:r>
+        <w:rPr>
+          <w:rFonts w:ascii="Consolas" w:eastAsia="Times New Roman" w:hAnsi="Consolas" w:cs="Consolas"/>
+          <w:color w:val="BBBEBF"/>
+          <w:sz w:val="21"/>
+          <w:szCs w:val="21"/>
+          <w:lang w:val="en-US" w:eastAsia="pt-BR"/>
+        </w:rPr>
+        <w:t>=</w:t>
+      </w:r>
+      <w:r>
+        <w:rPr>
+          <w:rFonts w:ascii="Consolas" w:eastAsia="Times New Roman" w:hAnsi="Consolas" w:cs="Consolas"/>
+          <w:color w:val="A5D6FF"/>
+          <w:sz w:val="21"/>
+          <w:szCs w:val="21"/>
+          <w:lang w:val="en-US" w:eastAsia="pt-BR"/>
+        </w:rPr>
+        <w:t>"9.0.2"</w:t>
+      </w:r>
+      <w:r>
+        <w:rPr>
+          <w:rFonts w:ascii="Consolas" w:eastAsia="Times New Roman" w:hAnsi="Consolas" w:cs="Consolas"/>
+          <w:color w:val="808080"/>
+          <w:sz w:val="21"/>
+          <w:szCs w:val="21"/>
+          <w:lang w:val="en-US" w:eastAsia="pt-BR"/>
+        </w:rPr>
+        <w:t>&gt;</w:t>
+      </w:r>
+    </w:p>
+    <w:p>
+      <w:pPr>
+        <w:shd w:val="clear" w:color="auto" w:fill="121314"/>
+        <w:spacing w:before="0" w:line="285" w:lineRule="atLeast"/>
+        <w:rPr>
+          <w:rFonts w:ascii="Consolas" w:eastAsia="Times New Roman" w:hAnsi="Consolas" w:cs="Consolas"/>
+          <w:color w:val="BBBEBF"/>
+          <w:sz w:val="21"/>
+          <w:szCs w:val="21"/>
+          <w:lang w:val="en-US" w:eastAsia="pt-BR"/>
+        </w:rPr>
+      </w:pPr>
+      <w:r>
+        <w:rPr>
+          <w:rFonts w:ascii="Consolas" w:eastAsia="Times New Roman" w:hAnsi="Consolas" w:cs="Consolas"/>
+          <w:color w:val="BBBEBF"/>
+          <w:sz w:val="21"/>
+          <w:szCs w:val="21"/>
+          <w:lang w:val="en-US" w:eastAsia="pt-BR"/>
+        </w:rPr>
+        <w:t xml:space="preserve">      </w:t>
+      </w:r>
+      <w:r>
+        <w:rPr>
+          <w:rFonts w:ascii="Consolas" w:eastAsia="Times New Roman" w:hAnsi="Consolas" w:cs="Consolas"/>
+          <w:color w:val="808080"/>
+          <w:sz w:val="21"/>
+          <w:szCs w:val="21"/>
+          <w:lang w:val="en-US" w:eastAsia="pt-BR"/>
+        </w:rPr>
+        <w:t>&lt;</w:t>
+      </w:r>
+      <w:proofErr w:type="spellStart"/>
+      <w:r>
+        <w:rPr>
+          <w:rFonts w:ascii="Consolas" w:eastAsia="Times New Roman" w:hAnsi="Consolas" w:cs="Consolas"/>
+          <w:color w:val="7EE787"/>
+          <w:sz w:val="21"/>
+          <w:szCs w:val="21"/>
+          <w:lang w:val="en-US" w:eastAsia="pt-BR"/>
+        </w:rPr>
+        <w:t>IncludeAssets</w:t>
+      </w:r>
+      <w:proofErr w:type="spellEnd"/>
+      <w:r>
+        <w:rPr>
+          <w:rFonts w:ascii="Consolas" w:eastAsia="Times New Roman" w:hAnsi="Consolas" w:cs="Consolas"/>
+          <w:color w:val="808080"/>
+          <w:sz w:val="21"/>
+          <w:szCs w:val="21"/>
+          <w:lang w:val="en-US" w:eastAsia="pt-BR"/>
+        </w:rPr>
+        <w:t>&gt;</w:t>
+      </w:r>
+      <w:r>
+        <w:rPr>
+          <w:rFonts w:ascii="Consolas" w:eastAsia="Times New Roman" w:hAnsi="Consolas" w:cs="Consolas"/>
+          <w:color w:val="BBBEBF"/>
+          <w:sz w:val="21"/>
+          <w:szCs w:val="21"/>
+          <w:lang w:val="en-US" w:eastAsia="pt-BR"/>
+        </w:rPr>
+        <w:t xml:space="preserve">runtime; build; native; </w:t>
+      </w:r>
+      <w:proofErr w:type="spellStart"/>
+      <w:r>
+        <w:rPr>
+          <w:rFonts w:ascii="Consolas" w:eastAsia="Times New Roman" w:hAnsi="Consolas" w:cs="Consolas"/>
+          <w:color w:val="BBBEBF"/>
+          <w:sz w:val="21"/>
+          <w:szCs w:val="21"/>
+          <w:lang w:val="en-US" w:eastAsia="pt-BR"/>
+        </w:rPr>
+        <w:t>contentfiles</w:t>
+      </w:r>
+      <w:proofErr w:type="spellEnd"/>
+      <w:r>
+        <w:rPr>
+          <w:rFonts w:ascii="Consolas" w:eastAsia="Times New Roman" w:hAnsi="Consolas" w:cs="Consolas"/>
+          <w:color w:val="BBBEBF"/>
+          <w:sz w:val="21"/>
+          <w:szCs w:val="21"/>
+          <w:lang w:val="en-US" w:eastAsia="pt-BR"/>
+        </w:rPr>
+        <w:t xml:space="preserve">; analyzers; </w:t>
+      </w:r>
+      <w:proofErr w:type="spellStart"/>
+      <w:r>
+        <w:rPr>
+          <w:rFonts w:ascii="Consolas" w:eastAsia="Times New Roman" w:hAnsi="Consolas" w:cs="Consolas"/>
+          <w:color w:val="BBBEBF"/>
+          <w:sz w:val="21"/>
+          <w:szCs w:val="21"/>
+          <w:lang w:val="en-US" w:eastAsia="pt-BR"/>
+        </w:rPr>
+        <w:t>buildtransitive</w:t>
+      </w:r>
+      <w:proofErr w:type="spellEnd"/>
+      <w:r>
+        <w:rPr>
+          <w:rFonts w:ascii="Consolas" w:eastAsia="Times New Roman" w:hAnsi="Consolas" w:cs="Consolas"/>
+          <w:color w:val="808080"/>
+          <w:sz w:val="21"/>
+          <w:szCs w:val="21"/>
+          <w:lang w:val="en-US" w:eastAsia="pt-BR"/>
+        </w:rPr>
+        <w:t>&lt;/</w:t>
+      </w:r>
+      <w:proofErr w:type="spellStart"/>
+      <w:r>
+        <w:rPr>
+          <w:rFonts w:ascii="Consolas" w:eastAsia="Times New Roman" w:hAnsi="Consolas" w:cs="Consolas"/>
+          <w:color w:val="7EE787"/>
+          <w:sz w:val="21"/>
+          <w:szCs w:val="21"/>
+          <w:lang w:val="en-US" w:eastAsia="pt-BR"/>
+        </w:rPr>
+        <w:t>IncludeAssets</w:t>
+      </w:r>
+      <w:proofErr w:type="spellEnd"/>
+      <w:r>
+        <w:rPr>
+          <w:rFonts w:ascii="Consolas" w:eastAsia="Times New Roman" w:hAnsi="Consolas" w:cs="Consolas"/>
+          <w:color w:val="808080"/>
+          <w:sz w:val="21"/>
+          <w:szCs w:val="21"/>
+          <w:lang w:val="en-US" w:eastAsia="pt-BR"/>
+        </w:rPr>
+        <w:t>&gt;</w:t>
+      </w:r>
+    </w:p>
+    <w:p>
+      <w:pPr>
+        <w:shd w:val="clear" w:color="auto" w:fill="121314"/>
+        <w:spacing w:before="0" w:line="285" w:lineRule="atLeast"/>
+        <w:rPr>
+          <w:rFonts w:ascii="Consolas" w:eastAsia="Times New Roman" w:hAnsi="Consolas" w:cs="Consolas"/>
+          <w:color w:val="BBBEBF"/>
+          <w:sz w:val="21"/>
+          <w:szCs w:val="21"/>
+          <w:lang w:val="en-US" w:eastAsia="pt-BR"/>
+        </w:rPr>
+      </w:pPr>
+      <w:r>
+        <w:rPr>
+          <w:rFonts w:ascii="Consolas" w:eastAsia="Times New Roman" w:hAnsi="Consolas" w:cs="Consolas"/>
+          <w:color w:val="BBBEBF"/>
+          <w:sz w:val="21"/>
+          <w:szCs w:val="21"/>
+          <w:lang w:val="en-US" w:eastAsia="pt-BR"/>
+        </w:rPr>
+        <w:t xml:space="preserve">      </w:t>
+      </w:r>
+      <w:r>
+        <w:rPr>
+          <w:rFonts w:ascii="Consolas" w:eastAsia="Times New Roman" w:hAnsi="Consolas" w:cs="Consolas"/>
+          <w:color w:val="808080"/>
+          <w:sz w:val="21"/>
+          <w:szCs w:val="21"/>
+          <w:lang w:val="en-US" w:eastAsia="pt-BR"/>
+        </w:rPr>
+        <w:t>&lt;</w:t>
+      </w:r>
+      <w:proofErr w:type="spellStart"/>
+      <w:r>
+        <w:rPr>
+          <w:rFonts w:ascii="Consolas" w:eastAsia="Times New Roman" w:hAnsi="Consolas" w:cs="Consolas"/>
+          <w:color w:val="7EE787"/>
+          <w:sz w:val="21"/>
+          <w:szCs w:val="21"/>
+          <w:lang w:val="en-US" w:eastAsia="pt-BR"/>
+        </w:rPr>
+        <w:t>PrivateAssets</w:t>
+      </w:r>
+      <w:proofErr w:type="spellEnd"/>
+      <w:r>
+        <w:rPr>
+          <w:rFonts w:ascii="Consolas" w:eastAsia="Times New Roman" w:hAnsi="Consolas" w:cs="Consolas"/>
+          <w:color w:val="808080"/>
+          <w:sz w:val="21"/>
+          <w:szCs w:val="21"/>
+          <w:lang w:val="en-US" w:eastAsia="pt-BR"/>
+        </w:rPr>
+        <w:t>&gt;</w:t>
+      </w:r>
+      <w:r>
+        <w:rPr>
+          <w:rFonts w:ascii="Consolas" w:eastAsia="Times New Roman" w:hAnsi="Consolas" w:cs="Consolas"/>
+          <w:color w:val="BBBEBF"/>
+          <w:sz w:val="21"/>
+          <w:szCs w:val="21"/>
+          <w:lang w:val="en-US" w:eastAsia="pt-BR"/>
+        </w:rPr>
+        <w:t>all</w:t>
+      </w:r>
+      <w:r>
+        <w:rPr>
+          <w:rFonts w:ascii="Consolas" w:eastAsia="Times New Roman" w:hAnsi="Consolas" w:cs="Consolas"/>
+          <w:color w:val="808080"/>
+          <w:sz w:val="21"/>
+          <w:szCs w:val="21"/>
+          <w:lang w:val="en-US" w:eastAsia="pt-BR"/>
+        </w:rPr>
+        <w:t>&lt;/</w:t>
+      </w:r>
+      <w:proofErr w:type="spellStart"/>
+      <w:r>
+        <w:rPr>
+          <w:rFonts w:ascii="Consolas" w:eastAsia="Times New Roman" w:hAnsi="Consolas" w:cs="Consolas"/>
+          <w:color w:val="7EE787"/>
+          <w:sz w:val="21"/>
+          <w:szCs w:val="21"/>
+          <w:lang w:val="en-US" w:eastAsia="pt-BR"/>
+        </w:rPr>
+        <w:t>PrivateAssets</w:t>
+      </w:r>
+      <w:proofErr w:type="spellEnd"/>
+      <w:r>
+        <w:rPr>
+          <w:rFonts w:ascii="Consolas" w:eastAsia="Times New Roman" w:hAnsi="Consolas" w:cs="Consolas"/>
+          <w:color w:val="808080"/>
+          <w:sz w:val="21"/>
+          <w:szCs w:val="21"/>
+          <w:lang w:val="en-US" w:eastAsia="pt-BR"/>
+        </w:rPr>
+        <w:t>&gt;</w:t>
+      </w:r>
+    </w:p>
+    <w:p>
+      <w:pPr>
+        <w:shd w:val="clear" w:color="auto" w:fill="121314"/>
+        <w:spacing w:before="0" w:line="285" w:lineRule="atLeast"/>
+        <w:rPr>
+          <w:rFonts w:ascii="Consolas" w:eastAsia="Times New Roman" w:hAnsi="Consolas" w:cs="Consolas"/>
+          <w:color w:val="BBBEBF"/>
+          <w:sz w:val="21"/>
+          <w:szCs w:val="21"/>
+          <w:lang w:val="en-US" w:eastAsia="pt-BR"/>
+        </w:rPr>
+      </w:pPr>
+      <w:r>
+        <w:rPr>
+          <w:rFonts w:ascii="Consolas" w:eastAsia="Times New Roman" w:hAnsi="Consolas" w:cs="Consolas"/>
+          <w:color w:val="BBBEBF"/>
+          <w:sz w:val="21"/>
+          <w:szCs w:val="21"/>
+          <w:lang w:val="en-US" w:eastAsia="pt-BR"/>
+        </w:rPr>
+        <w:t xml:space="preserve">    </w:t>
+      </w:r>
+      <w:r>
+        <w:rPr>
+          <w:rFonts w:ascii="Consolas" w:eastAsia="Times New Roman" w:hAnsi="Consolas" w:cs="Consolas"/>
+          <w:color w:val="808080"/>
+          <w:sz w:val="21"/>
+          <w:szCs w:val="21"/>
+          <w:lang w:val="en-US" w:eastAsia="pt-BR"/>
+        </w:rPr>
+        <w:t>&lt;/</w:t>
+      </w:r>
+      <w:proofErr w:type="spellStart"/>
+      <w:r>
+        <w:rPr>
+          <w:rFonts w:ascii="Consolas" w:eastAsia="Times New Roman" w:hAnsi="Consolas" w:cs="Consolas"/>
+          <w:color w:val="7EE787"/>
+          <w:sz w:val="21"/>
+          <w:szCs w:val="21"/>
+          <w:lang w:val="en-US" w:eastAsia="pt-BR"/>
+        </w:rPr>
+        <w:t>PackageReference</w:t>
+      </w:r>
+      <w:proofErr w:type="spellEnd"/>
+      <w:r>
+        <w:rPr>
+          <w:rFonts w:ascii="Consolas" w:eastAsia="Times New Roman" w:hAnsi="Consolas" w:cs="Consolas"/>
+          <w:color w:val="808080"/>
+          <w:sz w:val="21"/>
+          <w:szCs w:val="21"/>
+          <w:lang w:val="en-US" w:eastAsia="pt-BR"/>
+        </w:rPr>
+        <w:t>&gt;</w:t>
+      </w:r>
+    </w:p>
+    <w:p>
+      <w:pPr>
+        <w:shd w:val="clear" w:color="auto" w:fill="121314"/>
+        <w:spacing w:before="0" w:line="285" w:lineRule="atLeast"/>
+        <w:rPr>
+          <w:rFonts w:ascii="Consolas" w:eastAsia="Times New Roman" w:hAnsi="Consolas" w:cs="Consolas"/>
+          <w:color w:val="BBBEBF"/>
+          <w:sz w:val="21"/>
+          <w:szCs w:val="21"/>
+          <w:lang w:val="en-US" w:eastAsia="pt-BR"/>
+        </w:rPr>
+      </w:pPr>
+      <w:r>
+        <w:rPr>
+          <w:rFonts w:ascii="Consolas" w:eastAsia="Times New Roman" w:hAnsi="Consolas" w:cs="Consolas"/>
+          <w:color w:val="BBBEBF"/>
+          <w:sz w:val="21"/>
+          <w:szCs w:val="21"/>
+          <w:lang w:val="en-US" w:eastAsia="pt-BR"/>
+        </w:rPr>
+        <w:t xml:space="preserve">    </w:t>
+      </w:r>
+      <w:r>
+        <w:rPr>
+          <w:rFonts w:ascii="Consolas" w:eastAsia="Times New Roman" w:hAnsi="Consolas" w:cs="Consolas"/>
+          <w:color w:val="808080"/>
+          <w:sz w:val="21"/>
+          <w:szCs w:val="21"/>
+          <w:lang w:val="en-US" w:eastAsia="pt-BR"/>
+        </w:rPr>
+        <w:t>&lt;</w:t>
+      </w:r>
+      <w:proofErr w:type="spellStart"/>
+      <w:r>
+        <w:rPr>
+          <w:rFonts w:ascii="Consolas" w:eastAsia="Times New Roman" w:hAnsi="Consolas" w:cs="Consolas"/>
+          <w:color w:val="7EE787"/>
+          <w:sz w:val="21"/>
+          <w:szCs w:val="21"/>
+          <w:lang w:val="en-US" w:eastAsia="pt-BR"/>
+        </w:rPr>
+        <w:t>PackageReference</w:t>
+      </w:r>
+      <w:proofErr w:type="spellEnd"/>
+      <w:r>
+        <w:rPr>
+          <w:rFonts w:ascii="Consolas" w:eastAsia="Times New Roman" w:hAnsi="Consolas" w:cs="Consolas"/>
+          <w:color w:val="BBBEBF"/>
+          <w:sz w:val="21"/>
+          <w:szCs w:val="21"/>
+          <w:lang w:val="en-US" w:eastAsia="pt-BR"/>
+        </w:rPr>
+        <w:t xml:space="preserve"> </w:t>
+      </w:r>
+      <w:r>
+        <w:rPr>
+          <w:rFonts w:ascii="Consolas" w:eastAsia="Times New Roman" w:hAnsi="Consolas" w:cs="Consolas"/>
+          <w:color w:val="9CDCFE"/>
+          <w:sz w:val="21"/>
+          <w:szCs w:val="21"/>
+          <w:lang w:val="en-US" w:eastAsia="pt-BR"/>
+        </w:rPr>
+        <w:t>Include</w:t>
+      </w:r>
+      <w:r>
+        <w:rPr>
+          <w:rFonts w:ascii="Consolas" w:eastAsia="Times New Roman" w:hAnsi="Consolas" w:cs="Consolas"/>
+          <w:color w:val="BBBEBF"/>
+          <w:sz w:val="21"/>
+          <w:szCs w:val="21"/>
+          <w:lang w:val="en-US" w:eastAsia="pt-BR"/>
+        </w:rPr>
+        <w:t>=</w:t>
+      </w:r>
+      <w:r>
+        <w:rPr>
+          <w:rFonts w:ascii="Consolas" w:eastAsia="Times New Roman" w:hAnsi="Consolas" w:cs="Consolas"/>
+          <w:color w:val="A5D6FF"/>
+          <w:sz w:val="21"/>
+          <w:szCs w:val="21"/>
+          <w:lang w:val="en-US" w:eastAsia="pt-BR"/>
+        </w:rPr>
+        <w:t>"</w:t>
+      </w:r>
+      <w:proofErr w:type="spellStart"/>
+      <w:proofErr w:type="gramStart"/>
+      <w:r>
+        <w:rPr>
+          <w:rFonts w:ascii="Consolas" w:eastAsia="Times New Roman" w:hAnsi="Consolas" w:cs="Consolas"/>
+          <w:color w:val="A5D6FF"/>
+          <w:sz w:val="21"/>
+          <w:szCs w:val="21"/>
+          <w:lang w:val="en-US" w:eastAsia="pt-BR"/>
+        </w:rPr>
+        <w:t>Pomelo.EntityFrameworkCore.MySql</w:t>
+      </w:r>
+      <w:proofErr w:type="spellEnd"/>
+      <w:proofErr w:type="gramEnd"/>
+      <w:r>
+        <w:rPr>
+          <w:rFonts w:ascii="Consolas" w:eastAsia="Times New Roman" w:hAnsi="Consolas" w:cs="Consolas"/>
+          <w:color w:val="A5D6FF"/>
+          <w:sz w:val="21"/>
+          <w:szCs w:val="21"/>
+          <w:lang w:val="en-US" w:eastAsia="pt-BR"/>
+        </w:rPr>
+        <w:t>"</w:t>
+      </w:r>
+      <w:r>
+        <w:rPr>
+          <w:rFonts w:ascii="Consolas" w:eastAsia="Times New Roman" w:hAnsi="Consolas" w:cs="Consolas"/>
+          <w:color w:val="BBBEBF"/>
+          <w:sz w:val="21"/>
+          <w:szCs w:val="21"/>
+          <w:lang w:val="en-US" w:eastAsia="pt-BR"/>
+        </w:rPr>
+        <w:t xml:space="preserve"> </w:t>
+      </w:r>
+      <w:r>
+        <w:rPr>
+          <w:rFonts w:ascii="Consolas" w:eastAsia="Times New Roman" w:hAnsi="Consolas" w:cs="Consolas"/>
+          <w:color w:val="9CDCFE"/>
+          <w:sz w:val="21"/>
+          <w:szCs w:val="21"/>
+          <w:lang w:val="en-US" w:eastAsia="pt-BR"/>
+        </w:rPr>
+        <w:t>Version</w:t>
+      </w:r>
+      <w:r>
+        <w:rPr>
+          <w:rFonts w:ascii="Consolas" w:eastAsia="Times New Roman" w:hAnsi="Consolas" w:cs="Consolas"/>
+          <w:color w:val="BBBEBF"/>
+          <w:sz w:val="21"/>
+          <w:szCs w:val="21"/>
+          <w:lang w:val="en-US" w:eastAsia="pt-BR"/>
+        </w:rPr>
+        <w:t>=</w:t>
+      </w:r>
+      <w:r>
+        <w:rPr>
+          <w:rFonts w:ascii="Consolas" w:eastAsia="Times New Roman" w:hAnsi="Consolas" w:cs="Consolas"/>
+          <w:color w:val="A5D6FF"/>
+          <w:sz w:val="21"/>
+          <w:szCs w:val="21"/>
+          <w:lang w:val="en-US" w:eastAsia="pt-BR"/>
+        </w:rPr>
+        <w:t>"9.0.0"</w:t>
+      </w:r>
+      <w:r>
+        <w:rPr>
+          <w:rFonts w:ascii="Consolas" w:eastAsia="Times New Roman" w:hAnsi="Consolas" w:cs="Consolas"/>
+          <w:color w:val="BBBEBF"/>
+          <w:sz w:val="21"/>
+          <w:szCs w:val="21"/>
+          <w:lang w:val="en-US" w:eastAsia="pt-BR"/>
+        </w:rPr>
+        <w:t xml:space="preserve"> </w:t>
+      </w:r>
+      <w:r>
+        <w:rPr>
+          <w:rFonts w:ascii="Consolas" w:eastAsia="Times New Roman" w:hAnsi="Consolas" w:cs="Consolas"/>
+          <w:color w:val="808080"/>
+          <w:sz w:val="21"/>
+          <w:szCs w:val="21"/>
+          <w:lang w:val="en-US" w:eastAsia="pt-BR"/>
+        </w:rPr>
+        <w:t>/&gt;</w:t>
+      </w:r>
+    </w:p>
+    <w:p>
+      <w:pPr>
+        <w:shd w:val="clear" w:color="auto" w:fill="121314"/>
+        <w:spacing w:before="0" w:line="285" w:lineRule="atLeast"/>
+        <w:rPr>
+          <w:rFonts w:ascii="Consolas" w:eastAsia="Times New Roman" w:hAnsi="Consolas" w:cs="Consolas"/>
+          <w:color w:val="BBBEBF"/>
+          <w:sz w:val="21"/>
+          <w:szCs w:val="21"/>
+          <w:lang w:val="pt-BR" w:eastAsia="pt-BR"/>
+        </w:rPr>
+      </w:pPr>
+      <w:r>
+        <w:rPr>
+          <w:rFonts w:ascii="Consolas" w:eastAsia="Times New Roman" w:hAnsi="Consolas" w:cs="Consolas"/>
+          <w:color w:val="BBBEBF"/>
+          <w:sz w:val="21"/>
+          <w:szCs w:val="21"/>
+          <w:lang w:val="en-US" w:eastAsia="pt-BR"/>
+        </w:rPr>
+        <w:t xml:space="preserve">  </w:t>
+      </w:r>
+      <w:r>
+        <w:rPr>
+          <w:rFonts w:ascii="Consolas" w:eastAsia="Times New Roman" w:hAnsi="Consolas" w:cs="Consolas"/>
+          <w:color w:val="808080"/>
+          <w:sz w:val="21"/>
+          <w:szCs w:val="21"/>
+          <w:lang w:val="pt-BR" w:eastAsia="pt-BR"/>
+        </w:rPr>
+        <w:t>&lt;/</w:t>
+      </w:r>
+      <w:proofErr w:type="spellStart"/>
+      <w:r>
+        <w:rPr>
+          <w:rFonts w:ascii="Consolas" w:eastAsia="Times New Roman" w:hAnsi="Consolas" w:cs="Consolas"/>
+          <w:color w:val="7EE787"/>
+          <w:sz w:val="21"/>
+          <w:szCs w:val="21"/>
+          <w:lang w:val="pt-BR" w:eastAsia="pt-BR"/>
+        </w:rPr>
+        <w:t>ItemGroup</w:t>
+      </w:r>
+      <w:proofErr w:type="spellEnd"/>
+      <w:r>
+        <w:rPr>
+          <w:rFonts w:ascii="Consolas" w:eastAsia="Times New Roman" w:hAnsi="Consolas" w:cs="Consolas"/>
+          <w:color w:val="808080"/>
+          <w:sz w:val="21"/>
+          <w:szCs w:val="21"/>
+          <w:lang w:val="pt-BR" w:eastAsia="pt-BR"/>
+        </w:rPr>
+        <w:t>&gt;</w:t>
+      </w:r>
+    </w:p>
+    <w:p>
+      <w:pPr>
+        <w:shd w:val="clear" w:color="auto" w:fill="121314"/>
+        <w:spacing w:before="0" w:line="285" w:lineRule="atLeast"/>
+        <w:rPr>
+          <w:rFonts w:ascii="Consolas" w:eastAsia="Times New Roman" w:hAnsi="Consolas" w:cs="Consolas"/>
+          <w:color w:val="BBBEBF"/>
+          <w:sz w:val="21"/>
+          <w:szCs w:val="21"/>
+          <w:lang w:val="pt-BR" w:eastAsia="pt-BR"/>
+        </w:rPr>
+      </w:pPr>
+    </w:p>
+    <w:p>
+      <w:pPr>
+        <w:shd w:val="clear" w:color="auto" w:fill="121314"/>
+        <w:spacing w:before="0" w:line="285" w:lineRule="atLeast"/>
+        <w:rPr>
+          <w:rFonts w:ascii="Consolas" w:eastAsia="Times New Roman" w:hAnsi="Consolas" w:cs="Consolas"/>
+          <w:color w:val="BBBEBF"/>
+          <w:sz w:val="21"/>
+          <w:szCs w:val="21"/>
+          <w:lang w:val="pt-BR" w:eastAsia="pt-BR"/>
+        </w:rPr>
+      </w:pPr>
+      <w:r>
+        <w:rPr>
+          <w:rFonts w:ascii="Consolas" w:eastAsia="Times New Roman" w:hAnsi="Consolas" w:cs="Consolas"/>
+          <w:color w:val="808080"/>
+          <w:sz w:val="21"/>
+          <w:szCs w:val="21"/>
+          <w:lang w:val="pt-BR" w:eastAsia="pt-BR"/>
+        </w:rPr>
+        <w:t>&lt;/</w:t>
+      </w:r>
+      <w:r>
+        <w:rPr>
+          <w:rFonts w:ascii="Consolas" w:eastAsia="Times New Roman" w:hAnsi="Consolas" w:cs="Consolas"/>
+          <w:color w:val="7EE787"/>
+          <w:sz w:val="21"/>
+          <w:szCs w:val="21"/>
+          <w:lang w:val="pt-BR" w:eastAsia="pt-BR"/>
+        </w:rPr>
+        <w:t>Project</w:t>
+      </w:r>
+      <w:r>
+        <w:rPr>
+          <w:rFonts w:ascii="Consolas" w:eastAsia="Times New Roman" w:hAnsi="Consolas" w:cs="Consolas"/>
+          <w:color w:val="808080"/>
+          <w:sz w:val="21"/>
+          <w:szCs w:val="21"/>
+          <w:lang w:val="pt-BR" w:eastAsia="pt-BR"/>
+        </w:rPr>
+        <w:t>&gt;</w:t>
+      </w:r>
+    </w:p>
+    <w:p>
+      <w:pPr>
+        <w:shd w:val="clear" w:color="auto" w:fill="121314"/>
+        <w:spacing w:before="0" w:line="285" w:lineRule="atLeast"/>
+        <w:rPr>
+          <w:rFonts w:ascii="Consolas" w:eastAsia="Times New Roman" w:hAnsi="Consolas" w:cs="Consolas"/>
+          <w:color w:val="BBBEBF"/>
+          <w:sz w:val="21"/>
+          <w:szCs w:val="21"/>
+          <w:lang w:val="pt-BR" w:eastAsia="pt-BR"/>
+        </w:rPr>
+      </w:pPr>
+    </w:p>
+    <w:p>
+      <w:pPr>
+        <w:rPr>
+          <w:lang w:val="en-US"/>
+        </w:rPr>
+      </w:pPr>
     </w:p>
     <w:p>
       <w:pPr>
         <w:pStyle w:val="Numerada"/>
         <w:numPr>
           <w:ilvl w:val="0"/>
-          <w:numId w:val="33"/>
+          <w:numId w:val="38"/>
         </w:numPr>
         <w:rPr>
           <w:lang w:val="pt-BR"/>
@@ -2642,474 +4790,117 @@
       </w:pPr>
       <w:r>
         <w:rPr>
-          <w:lang w:val="pt-BR" w:bidi="pt-BR"/>
-        </w:rPr>
-        <w:t xml:space="preserve">Na guia </w:t>
-      </w:r>
-      <w:r>
-        <w:rPr>
-          <w:rStyle w:val="Forte"/>
-          <w:lang w:val="pt-BR" w:bidi="pt-BR"/>
-        </w:rPr>
-        <w:t>Referências</w:t>
-      </w:r>
-      <w:r>
-        <w:rPr>
-          <w:lang w:val="pt-BR" w:bidi="pt-BR"/>
-        </w:rPr>
-        <w:t xml:space="preserve">, clique em </w:t>
-      </w:r>
-      <w:r>
-        <w:rPr>
-          <w:rStyle w:val="Forte"/>
-          <w:lang w:val="pt-BR" w:bidi="pt-BR"/>
-        </w:rPr>
-        <w:t>Sumário</w:t>
-      </w:r>
-      <w:r>
-        <w:rPr>
-          <w:rStyle w:val="Forte"/>
-          <w:lang w:val="pt-BR" w:bidi="pt-BR"/>
-        </w:rPr>
-        <w:t xml:space="preserve"> </w:t>
-      </w:r>
-      <w:r>
-        <w:rPr>
-          <w:lang w:val="pt-BR" w:bidi="pt-BR"/>
-        </w:rPr>
-        <w:t xml:space="preserve">e, em seguida, na parte inferior, clique em </w:t>
-      </w:r>
-      <w:r>
-        <w:rPr>
-          <w:rStyle w:val="Forte"/>
-          <w:lang w:val="pt-BR" w:bidi="pt-BR"/>
-        </w:rPr>
-        <w:t>Personalizar Sumário</w:t>
-      </w:r>
-      <w:r>
-        <w:rPr>
-          <w:lang w:val="pt-BR" w:bidi="pt-BR"/>
-        </w:rPr>
-        <w:t>.</w:t>
+          <w:lang w:val="pt-BR"/>
+        </w:rPr>
+        <w:t>Digite os comandos</w:t>
       </w:r>
     </w:p>
     <w:p>
       <w:pPr>
-        <w:pStyle w:val="Numerada"/>
-        <w:keepNext/>
-        <w:numPr>
-          <w:ilvl w:val="0"/>
-          <w:numId w:val="33"/>
-        </w:numPr>
         <w:rPr>
           <w:lang w:val="pt-BR"/>
         </w:rPr>
       </w:pPr>
-      <w:r>
-        <w:rPr>
-          <w:lang w:val="pt-BR" w:bidi="pt-BR"/>
-        </w:rPr>
-        <w:t xml:space="preserve">Altere </w:t>
-      </w:r>
-      <w:r>
-        <w:rPr>
-          <w:rStyle w:val="Forte"/>
-          <w:lang w:val="pt-BR" w:bidi="pt-BR"/>
-        </w:rPr>
-        <w:t>Mostrar níveis</w:t>
-      </w:r>
-      <w:r>
-        <w:rPr>
-          <w:lang w:val="pt-BR" w:bidi="pt-BR"/>
-        </w:rPr>
-        <w:t xml:space="preserve"> para </w:t>
-      </w:r>
-      <w:r>
-        <w:rPr>
-          <w:rStyle w:val="Forte"/>
-          <w:lang w:val="pt-BR" w:bidi="pt-BR"/>
-        </w:rPr>
-        <w:t>1</w:t>
-      </w:r>
-      <w:r>
-        <w:rPr>
-          <w:lang w:val="pt-BR" w:bidi="pt-BR"/>
-        </w:rPr>
-        <w:t xml:space="preserve"> e clique em </w:t>
-      </w:r>
-      <w:r>
-        <w:rPr>
-          <w:rStyle w:val="Forte"/>
-          <w:lang w:val="pt-BR" w:bidi="pt-BR"/>
-        </w:rPr>
-        <w:t>O</w:t>
-      </w:r>
-      <w:r>
-        <w:rPr>
-          <w:rStyle w:val="Forte"/>
-          <w:lang w:val="pt-BR" w:bidi="pt-BR"/>
-        </w:rPr>
-        <w:t>K</w:t>
-      </w:r>
-      <w:r>
-        <w:rPr>
-          <w:lang w:val="pt-BR" w:bidi="pt-BR"/>
-        </w:rPr>
-        <w:t>.</w:t>
-      </w:r>
     </w:p>
     <w:p>
       <w:pPr>
-        <w:pStyle w:val="PargrafodaLista"/>
-        <w:rPr>
-          <w:lang w:val="pt-BR"/>
+        <w:rPr>
+          <w:highlight w:val="lightGray"/>
+          <w:lang w:val="en-US"/>
         </w:rPr>
       </w:pPr>
       <w:r>
         <w:rPr>
-          <w:noProof/>
-          <w:highlight w:val="yellow"/>
-          <w:lang w:val="en-US" w:eastAsia="zh-CN"/>
-        </w:rPr>
-        <w:drawing>
-          <wp:inline distT="0" distB="0" distL="0" distR="0" wp14:anchorId="0CBCE5B5" wp14:editId="5D35D60D">
-            <wp:extent cx="2284924" cy="3205589"/>
-            <wp:effectExtent l="0" t="0" r="1270" b="0"/>
-            <wp:docPr id="16" name="Imagem 16"/>
-            <wp:cNvGraphicFramePr>
-              <a:graphicFrameLocks xmlns:a="http://schemas.openxmlformats.org/drawingml/2006/main" noChangeAspect="1"/>
-            </wp:cNvGraphicFramePr>
-            <a:graphic xmlns:a="http://schemas.openxmlformats.org/drawingml/2006/main">
-              <a:graphicData uri="http://schemas.openxmlformats.org/drawingml/2006/picture">
-                <pic:pic xmlns:pic="http://schemas.openxmlformats.org/drawingml/2006/picture">
-                  <pic:nvPicPr>
-                    <pic:cNvPr id="1" name=""/>
-                    <pic:cNvPicPr/>
-                  </pic:nvPicPr>
-                  <pic:blipFill>
-                    <a:blip r:embed="rId8"/>
-                    <a:stretch>
-                      <a:fillRect/>
-                    </a:stretch>
-                  </pic:blipFill>
-                  <pic:spPr>
-                    <a:xfrm>
-                      <a:off x="0" y="0"/>
-                      <a:ext cx="2284924" cy="3205589"/>
-                    </a:xfrm>
-                    <a:prstGeom prst="rect">
-                      <a:avLst/>
-                    </a:prstGeom>
-                  </pic:spPr>
-                </pic:pic>
-              </a:graphicData>
-            </a:graphic>
-          </wp:inline>
-        </w:drawing>
+          <w:highlight w:val="lightGray"/>
+          <w:lang w:val="en-US"/>
+        </w:rPr>
+        <w:t>dotnet clean</w:t>
       </w:r>
     </w:p>
     <w:p>
       <w:pPr>
-        <w:pStyle w:val="Numerada"/>
-        <w:rPr>
-          <w:lang w:val="pt-BR"/>
+        <w:rPr>
+          <w:highlight w:val="lightGray"/>
+          <w:lang w:val="en-US"/>
         </w:rPr>
       </w:pPr>
       <w:r>
         <w:rPr>
-          <w:lang w:val="pt-BR" w:bidi="pt-BR"/>
-        </w:rPr>
-        <w:t xml:space="preserve">Quando estiver pronto para substituir o Sumário, clique em </w:t>
-      </w:r>
-      <w:r>
-        <w:rPr>
-          <w:rStyle w:val="Forte"/>
-          <w:lang w:val="pt-BR" w:bidi="pt-BR"/>
-        </w:rPr>
-        <w:t>Sim</w:t>
-      </w:r>
-      <w:r>
-        <w:rPr>
-          <w:lang w:val="pt-BR" w:bidi="pt-BR"/>
-        </w:rPr>
-        <w:t>.</w:t>
+          <w:highlight w:val="lightGray"/>
+          <w:lang w:val="en-US"/>
+        </w:rPr>
+        <w:t>dotnet restore --no-cache</w:t>
       </w:r>
     </w:p>
     <w:p>
       <w:pPr>
-        <w:pStyle w:val="Numerada"/>
-        <w:rPr>
-          <w:lang w:val="pt-BR"/>
+        <w:rPr>
+          <w:lang w:val="en-US"/>
         </w:rPr>
       </w:pPr>
       <w:r>
         <w:rPr>
-          <w:lang w:val="pt-BR" w:bidi="pt-BR"/>
-        </w:rPr>
-        <w:t xml:space="preserve">Verifique se o Sumário não inclui os subtítulos, como </w:t>
-      </w:r>
-      <w:r>
-        <w:rPr>
-          <w:rStyle w:val="Caracteredenfasedecitao"/>
-          <w:lang w:val="pt-BR" w:bidi="pt-BR"/>
-        </w:rPr>
-        <w:t>Adicionar uma entrada de Sumário Nível 2</w:t>
-      </w:r>
-      <w:r>
-        <w:rPr>
-          <w:lang w:val="pt-BR" w:bidi="pt-BR"/>
-        </w:rPr>
-        <w:t xml:space="preserve">. </w:t>
+          <w:highlight w:val="lightGray"/>
+          <w:lang w:val="en-US"/>
+        </w:rPr>
+        <w:t>dotnet build</w:t>
       </w:r>
     </w:p>
     <w:p>
       <w:pPr>
-        <w:pStyle w:val="Ttulo1"/>
-        <w:rPr>
-          <w:lang w:val="pt-BR"/>
+        <w:rPr>
+          <w:lang w:val="en-US"/>
         </w:rPr>
       </w:pPr>
-      <w:r>
-        <w:rPr>
-          <w:lang w:val="pt-BR" w:bidi="pt-BR"/>
-        </w:rPr>
-        <w:lastRenderedPageBreak/>
-        <w:t>Obter ajuda no Word</w:t>
-      </w:r>
     </w:p>
     <w:p>
       <w:pPr>
-        <w:keepNext/>
-        <w:rPr>
-          <w:lang w:val="pt-BR"/>
+        <w:rPr>
+          <w:lang w:val="en-US"/>
         </w:rPr>
       </w:pPr>
       <w:r>
         <w:rPr>
-          <w:lang w:val="pt-BR" w:bidi="pt-BR"/>
-        </w:rPr>
-        <w:t xml:space="preserve">A caixa de pesquisa </w:t>
-      </w:r>
-      <w:r>
-        <w:rPr>
-          <w:rStyle w:val="Forte"/>
-          <w:lang w:val="pt-BR" w:bidi="pt-BR"/>
-        </w:rPr>
-        <w:t>Diga-me</w:t>
-      </w:r>
-      <w:r>
-        <w:rPr>
-          <w:lang w:val="pt-BR" w:bidi="pt-BR"/>
-        </w:rPr>
-        <w:t xml:space="preserve"> levará você direto para os comandos e para a Ajuda no Word.</w:t>
-      </w:r>
+          <w:highlight w:val="lightGray"/>
+          <w:lang w:val="en-US"/>
+        </w:rPr>
+        <w:t xml:space="preserve">dotnet </w:t>
+      </w:r>
+      <w:proofErr w:type="spellStart"/>
+      <w:r>
+        <w:rPr>
+          <w:highlight w:val="lightGray"/>
+          <w:lang w:val="en-US"/>
+        </w:rPr>
+        <w:t>ef</w:t>
+      </w:r>
+      <w:proofErr w:type="spellEnd"/>
+      <w:r>
+        <w:rPr>
+          <w:highlight w:val="lightGray"/>
+          <w:lang w:val="en-US"/>
+        </w:rPr>
+        <w:t xml:space="preserve"> migrations add </w:t>
+      </w:r>
+      <w:proofErr w:type="spellStart"/>
+      <w:r>
+        <w:rPr>
+          <w:highlight w:val="lightGray"/>
+          <w:lang w:val="en-US"/>
+        </w:rPr>
+        <w:t>AtualizaTabelaUsuarios</w:t>
+      </w:r>
+      <w:proofErr w:type="spellEnd"/>
     </w:p>
     <w:p>
       <w:pPr>
         <w:rPr>
-          <w:lang w:val="pt-BR"/>
-        </w:rPr>
-      </w:pPr>
-      <w:r>
-        <w:rPr>
-          <w:noProof/>
-          <w:lang w:val="en-US" w:eastAsia="zh-CN"/>
-        </w:rPr>
-        <w:drawing>
-          <wp:inline distT="0" distB="0" distL="0" distR="0" wp14:anchorId="359B9670" wp14:editId="05D6FF48">
-            <wp:extent cx="3018596" cy="2395609"/>
-            <wp:effectExtent l="0" t="0" r="0" b="5080"/>
-            <wp:docPr id="18" name="Imagem 18"/>
-            <wp:cNvGraphicFramePr>
-              <a:graphicFrameLocks xmlns:a="http://schemas.openxmlformats.org/drawingml/2006/main" noChangeAspect="1"/>
-            </wp:cNvGraphicFramePr>
-            <a:graphic xmlns:a="http://schemas.openxmlformats.org/drawingml/2006/main">
-              <a:graphicData uri="http://schemas.openxmlformats.org/drawingml/2006/picture">
-                <pic:pic xmlns:pic="http://schemas.openxmlformats.org/drawingml/2006/picture">
-                  <pic:nvPicPr>
-                    <pic:cNvPr id="1" name=""/>
-                    <pic:cNvPicPr/>
-                  </pic:nvPicPr>
-                  <pic:blipFill>
-                    <a:blip r:embed="rId9"/>
-                    <a:stretch>
-                      <a:fillRect/>
-                    </a:stretch>
-                  </pic:blipFill>
-                  <pic:spPr>
-                    <a:xfrm>
-                      <a:off x="0" y="0"/>
-                      <a:ext cx="3018596" cy="2395609"/>
-                    </a:xfrm>
-                    <a:prstGeom prst="rect">
-                      <a:avLst/>
-                    </a:prstGeom>
-                  </pic:spPr>
-                </pic:pic>
-              </a:graphicData>
-            </a:graphic>
-          </wp:inline>
-        </w:drawing>
-      </w:r>
-    </w:p>
-    <w:p>
-      <w:pPr>
-        <w:rPr>
-          <w:lang w:val="pt-BR"/>
-        </w:rPr>
-      </w:pPr>
-      <w:r>
-        <w:rPr>
-          <w:rStyle w:val="nfase"/>
-          <w:lang w:val="pt-BR" w:bidi="pt-BR"/>
-        </w:rPr>
-        <w:t>Experimente:</w:t>
-      </w:r>
-      <w:r>
-        <w:rPr>
-          <w:lang w:val="pt-BR" w:bidi="pt-BR"/>
-        </w:rPr>
-        <w:t xml:space="preserve"> Vá para </w:t>
-      </w:r>
-      <w:r>
-        <w:rPr>
-          <w:rStyle w:val="Forte"/>
-          <w:lang w:val="pt-BR" w:bidi="pt-BR"/>
-        </w:rPr>
-        <w:t>Diga-me o que você deseja</w:t>
-      </w:r>
-      <w:r>
-        <w:rPr>
-          <w:rStyle w:val="Forte"/>
-          <w:lang w:val="pt-BR" w:bidi="pt-BR"/>
-        </w:rPr>
-        <w:t xml:space="preserve"> fazer</w:t>
-      </w:r>
-      <w:r>
-        <w:rPr>
-          <w:lang w:val="pt-BR" w:bidi="pt-BR"/>
-        </w:rPr>
-        <w:t xml:space="preserve"> próximo à parte superior da janela e, em seguida, digite o que você deseja.</w:t>
-      </w:r>
-    </w:p>
-    <w:p>
-      <w:pPr>
-        <w:rPr>
-          <w:lang w:val="pt-BR"/>
-        </w:rPr>
-      </w:pPr>
-      <w:r>
-        <w:rPr>
-          <w:lang w:val="pt-BR" w:bidi="pt-BR"/>
-        </w:rPr>
-        <w:t>Por exemplo, digite:</w:t>
-      </w:r>
-    </w:p>
-    <w:p>
-      <w:pPr>
-        <w:numPr>
-          <w:ilvl w:val="0"/>
-          <w:numId w:val="5"/>
-        </w:numPr>
-        <w:rPr>
-          <w:lang w:val="pt-BR"/>
-        </w:rPr>
-      </w:pPr>
-      <w:r>
-        <w:rPr>
-          <w:rStyle w:val="Forte"/>
-          <w:lang w:val="pt-BR" w:bidi="pt-BR"/>
-        </w:rPr>
-        <w:t>sumário</w:t>
-      </w:r>
-      <w:r>
-        <w:rPr>
-          <w:lang w:val="pt-BR" w:bidi="pt-BR"/>
-        </w:rPr>
-        <w:t xml:space="preserve"> para acessar rapidamente as opções do sumário e outros tópicos de ajuda do Sumário</w:t>
-      </w:r>
-    </w:p>
-    <w:p>
-      <w:pPr>
-        <w:numPr>
-          <w:ilvl w:val="0"/>
-          <w:numId w:val="5"/>
-        </w:numPr>
-        <w:rPr>
-          <w:lang w:val="pt-BR"/>
-        </w:rPr>
-      </w:pPr>
-      <w:r>
-        <w:rPr>
-          <w:rStyle w:val="Forte"/>
-          <w:lang w:val="pt-BR" w:bidi="pt-BR"/>
-        </w:rPr>
-        <w:t xml:space="preserve">estilos </w:t>
-      </w:r>
-      <w:r>
-        <w:rPr>
-          <w:lang w:val="pt-BR" w:bidi="pt-BR"/>
-        </w:rPr>
-        <w:t>se quiser saber mais sobre como usar estilos no Word</w:t>
-      </w:r>
-    </w:p>
-    <w:p>
-      <w:pPr>
-        <w:numPr>
-          <w:ilvl w:val="0"/>
-          <w:numId w:val="5"/>
-        </w:numPr>
-        <w:rPr>
-          <w:lang w:val="pt-BR"/>
-        </w:rPr>
-      </w:pPr>
-      <w:r>
-        <w:rPr>
-          <w:rStyle w:val="Forte"/>
-          <w:lang w:val="pt-BR" w:bidi="pt-BR"/>
-        </w:rPr>
-        <w:t>ajuda</w:t>
-      </w:r>
-      <w:r>
-        <w:rPr>
-          <w:lang w:val="pt-BR" w:bidi="pt-BR"/>
-        </w:rPr>
-        <w:t xml:space="preserve"> para acessar a ajuda do Word.</w:t>
-      </w:r>
-    </w:p>
-    <w:p>
-      <w:pPr>
-        <w:numPr>
-          <w:ilvl w:val="0"/>
-          <w:numId w:val="5"/>
-        </w:numPr>
-        <w:rPr>
-          <w:lang w:val="pt-BR"/>
-        </w:rPr>
-      </w:pPr>
-      <w:r>
-        <w:rPr>
-          <w:rStyle w:val="Forte"/>
-          <w:lang w:val="pt-BR" w:bidi="pt-BR"/>
-        </w:rPr>
-        <w:t>treinamento</w:t>
-      </w:r>
-      <w:r>
-        <w:rPr>
-          <w:lang w:val="pt-BR" w:bidi="pt-BR"/>
-        </w:rPr>
-        <w:t xml:space="preserve"> para ver a lista de cursos de treinamento do Word.</w:t>
-      </w:r>
-    </w:p>
-    <w:p>
-      <w:pPr>
-        <w:rPr>
-          <w:lang w:val="pt-BR"/>
+          <w:lang w:val="en-US"/>
         </w:rPr>
       </w:pPr>
     </w:p>
     <w:sectPr>
-      <w:footerReference w:type="default" r:id="rId10"/>
+      <w:footerReference w:type="default" r:id="rId8"/>
       <w:pgSz w:w="11906" w:h="16838" w:code="9"/>
       <w:pgMar w:top="1134" w:right="1134" w:bottom="1134" w:left="1134" w:header="289" w:footer="720" w:gutter="0"/>
       <w:pgNumType w:start="1"/>
@@ -5202,6 +6993,96 @@
       <w:startOverride w:val="1"/>
     </w:lvlOverride>
   </w:num>
+  <w:num w:numId="38" w16cid:durableId="1534490517">
+    <w:abstractNumId w:val="18"/>
+    <w:lvlOverride w:ilvl="0">
+      <w:startOverride w:val="1"/>
+    </w:lvlOverride>
+    <w:lvlOverride w:ilvl="1">
+      <w:startOverride w:val="1"/>
+    </w:lvlOverride>
+    <w:lvlOverride w:ilvl="2">
+      <w:startOverride w:val="1"/>
+    </w:lvlOverride>
+    <w:lvlOverride w:ilvl="3">
+      <w:startOverride w:val="1"/>
+    </w:lvlOverride>
+    <w:lvlOverride w:ilvl="4">
+      <w:startOverride w:val="1"/>
+    </w:lvlOverride>
+    <w:lvlOverride w:ilvl="5">
+      <w:startOverride w:val="1"/>
+    </w:lvlOverride>
+    <w:lvlOverride w:ilvl="6">
+      <w:startOverride w:val="1"/>
+    </w:lvlOverride>
+    <w:lvlOverride w:ilvl="7">
+      <w:startOverride w:val="1"/>
+    </w:lvlOverride>
+    <w:lvlOverride w:ilvl="8">
+      <w:startOverride w:val="1"/>
+    </w:lvlOverride>
+  </w:num>
+  <w:num w:numId="39" w16cid:durableId="1083601453">
+    <w:abstractNumId w:val="18"/>
+    <w:lvlOverride w:ilvl="0">
+      <w:startOverride w:val="1"/>
+    </w:lvlOverride>
+    <w:lvlOverride w:ilvl="1">
+      <w:startOverride w:val="1"/>
+    </w:lvlOverride>
+    <w:lvlOverride w:ilvl="2">
+      <w:startOverride w:val="1"/>
+    </w:lvlOverride>
+    <w:lvlOverride w:ilvl="3">
+      <w:startOverride w:val="1"/>
+    </w:lvlOverride>
+    <w:lvlOverride w:ilvl="4">
+      <w:startOverride w:val="1"/>
+    </w:lvlOverride>
+    <w:lvlOverride w:ilvl="5">
+      <w:startOverride w:val="1"/>
+    </w:lvlOverride>
+    <w:lvlOverride w:ilvl="6">
+      <w:startOverride w:val="1"/>
+    </w:lvlOverride>
+    <w:lvlOverride w:ilvl="7">
+      <w:startOverride w:val="1"/>
+    </w:lvlOverride>
+    <w:lvlOverride w:ilvl="8">
+      <w:startOverride w:val="1"/>
+    </w:lvlOverride>
+  </w:num>
+  <w:num w:numId="40" w16cid:durableId="1273900174">
+    <w:abstractNumId w:val="18"/>
+    <w:lvlOverride w:ilvl="0">
+      <w:startOverride w:val="1"/>
+    </w:lvlOverride>
+    <w:lvlOverride w:ilvl="1">
+      <w:startOverride w:val="1"/>
+    </w:lvlOverride>
+    <w:lvlOverride w:ilvl="2">
+      <w:startOverride w:val="1"/>
+    </w:lvlOverride>
+    <w:lvlOverride w:ilvl="3">
+      <w:startOverride w:val="1"/>
+    </w:lvlOverride>
+    <w:lvlOverride w:ilvl="4">
+      <w:startOverride w:val="1"/>
+    </w:lvlOverride>
+    <w:lvlOverride w:ilvl="5">
+      <w:startOverride w:val="1"/>
+    </w:lvlOverride>
+    <w:lvlOverride w:ilvl="6">
+      <w:startOverride w:val="1"/>
+    </w:lvlOverride>
+    <w:lvlOverride w:ilvl="7">
+      <w:startOverride w:val="1"/>
+    </w:lvlOverride>
+    <w:lvlOverride w:ilvl="8">
+      <w:startOverride w:val="1"/>
+    </w:lvlOverride>
+  </w:num>
 </w:numbering>
 </file>
 

</xml_diff>